<commit_message>
Design pass 1.15: teksten uit Word, mobiele fixes, winkelkarretje
- 34 tekstwijzigingen uit het Word-document ingelezen (o.a. vacuümdroger,
  Managing Director, nieuwe referentienamen)
- Offertepagina: compacte productkaart op mobiel; 'Nog iets toevoegen?'
  verwijst naar producten en huurtoestellen
- Catalogus: filterkolom hersteld (klasse-conflict), scroll-hint op de
  categoriebalk, lange specificaties lopen niet meer uit de kaart
- Compactere typografie op kleine schermen, scherper icoon van Marc,
  handcursor op de zoekknop, winkelkarretje als offerte-icoon in de header

Co-Authored-By: Claude Opus 5.5 <noreply@anthropic.com>
</commit_message>
<xml_diff>
--- a/design/copy/Triple-R-websiteteksten.docx
+++ b/design/copy/Triple-R-websiteteksten.docx
@@ -484,7 +484,7 @@
               <w:spacing w:after="60"/>
             </w:pPr>
             <w:r>
-              <w:t xml:space="preserve">Triple R-bypassfilters verwijderen vaste deeltjes, varnish, water en lucht uit hydraulische olie en smeerolie, met één filterconcept.</w:t>
+              <w:t xml:space="preserve">Triple R-bypassfilters verwijderen vaste deeltjes, varnish, water en luchtbellen uit hydraulische olie en smeerolie, met één filterconcept.</w:t>
             </w:r>
           </w:p>
         </w:tc>
@@ -1408,7 +1408,7 @@
               <w:spacing w:after="60"/>
             </w:pPr>
             <w:r>
-              <w:t xml:space="preserve">Vertrouwd door machinebouwers en rederijen</w:t>
+              <w:t xml:space="preserve">Vertrouwd door OEM’s, multinationals en kmo’s</w:t>
             </w:r>
           </w:p>
         </w:tc>
@@ -1540,7 +1540,7 @@
               <w:spacing w:after="60"/>
             </w:pPr>
             <w:r>
-              <w:t xml:space="preserve">Yokohama</w:t>
+              <w:t xml:space="preserve">Battenfeld</w:t>
             </w:r>
           </w:p>
         </w:tc>
@@ -1936,6 +1936,468 @@
               <w:spacing w:after="60"/>
             </w:pPr>
             <w:r>
+              <w:t xml:space="preserve">Equans</w:t>
+            </w:r>
+          </w:p>
+        </w:tc>
+        <w:tc>
+          <w:tcPr>
+            <w:tcW w:w="5900" w:type="dxa"/>
+            <w:shd w:val="clear" w:color="auto" w:fill="FFFBEA"/>
+          </w:tcPr>
+          <w:p>
+            <w:pPr>
+              <w:spacing w:after="60"/>
+            </w:pPr>
+            <w:r>
+              <w:t xml:space="preserve"/>
+            </w:r>
+          </w:p>
+        </w:tc>
+      </w:tr>
+      <w:tr>
+        <w:trPr>
+          <w:cantSplit/>
+        </w:trPr>
+        <w:tc>
+          <w:tcPr>
+            <w:tcW w:w="1250" w:type="dxa"/>
+          </w:tcPr>
+          <w:p>
+            <w:pPr>
+              <w:spacing w:after="60"/>
+            </w:pPr>
+            <w:r>
+              <w:rPr>
+                <w:color w:val="666666"/>
+                <w:sz w:val="16"/>
+              </w:rPr>
+              <w:t xml:space="preserve">HOME-028</w:t>
+            </w:r>
+          </w:p>
+        </w:tc>
+        <w:tc>
+          <w:tcPr>
+            <w:tcW w:w="1800" w:type="dxa"/>
+          </w:tcPr>
+          <w:p>
+            <w:pPr>
+              <w:spacing w:after="60"/>
+            </w:pPr>
+            <w:r>
+              <w:rPr>
+                <w:color w:val="444444"/>
+                <w:sz w:val="18"/>
+              </w:rPr>
+              <w:t xml:space="preserve">Opsomming</w:t>
+            </w:r>
+          </w:p>
+        </w:tc>
+        <w:tc>
+          <w:tcPr>
+            <w:tcW w:w="5900" w:type="dxa"/>
+          </w:tcPr>
+          <w:p>
+            <w:pPr>
+              <w:spacing w:after="60"/>
+            </w:pPr>
+            <w:r>
+              <w:t xml:space="preserve">Ferrari</w:t>
+            </w:r>
+          </w:p>
+        </w:tc>
+        <w:tc>
+          <w:tcPr>
+            <w:tcW w:w="5900" w:type="dxa"/>
+            <w:shd w:val="clear" w:color="auto" w:fill="FFFBEA"/>
+          </w:tcPr>
+          <w:p>
+            <w:pPr>
+              <w:spacing w:after="60"/>
+            </w:pPr>
+            <w:r>
+              <w:t xml:space="preserve"/>
+            </w:r>
+          </w:p>
+        </w:tc>
+      </w:tr>
+      <w:tr>
+        <w:trPr>
+          <w:cantSplit/>
+        </w:trPr>
+        <w:tc>
+          <w:tcPr>
+            <w:tcW w:w="1250" w:type="dxa"/>
+          </w:tcPr>
+          <w:p>
+            <w:pPr>
+              <w:spacing w:after="60"/>
+            </w:pPr>
+            <w:r>
+              <w:rPr>
+                <w:color w:val="666666"/>
+                <w:sz w:val="16"/>
+              </w:rPr>
+              <w:t xml:space="preserve">HOME-029</w:t>
+            </w:r>
+          </w:p>
+        </w:tc>
+        <w:tc>
+          <w:tcPr>
+            <w:tcW w:w="1800" w:type="dxa"/>
+          </w:tcPr>
+          <w:p>
+            <w:pPr>
+              <w:spacing w:after="60"/>
+            </w:pPr>
+            <w:r>
+              <w:rPr>
+                <w:color w:val="444444"/>
+                <w:sz w:val="18"/>
+              </w:rPr>
+              <w:t xml:space="preserve">Opsomming</w:t>
+            </w:r>
+          </w:p>
+        </w:tc>
+        <w:tc>
+          <w:tcPr>
+            <w:tcW w:w="5900" w:type="dxa"/>
+          </w:tcPr>
+          <w:p>
+            <w:pPr>
+              <w:spacing w:after="60"/>
+            </w:pPr>
+            <w:r>
+              <w:t xml:space="preserve">Apiroc</w:t>
+            </w:r>
+          </w:p>
+        </w:tc>
+        <w:tc>
+          <w:tcPr>
+            <w:tcW w:w="5900" w:type="dxa"/>
+            <w:shd w:val="clear" w:color="auto" w:fill="FFFBEA"/>
+          </w:tcPr>
+          <w:p>
+            <w:pPr>
+              <w:spacing w:after="60"/>
+            </w:pPr>
+            <w:r>
+              <w:t xml:space="preserve"/>
+            </w:r>
+          </w:p>
+        </w:tc>
+      </w:tr>
+      <w:tr>
+        <w:trPr>
+          <w:cantSplit/>
+        </w:trPr>
+        <w:tc>
+          <w:tcPr>
+            <w:tcW w:w="1250" w:type="dxa"/>
+          </w:tcPr>
+          <w:p>
+            <w:pPr>
+              <w:spacing w:after="60"/>
+            </w:pPr>
+            <w:r>
+              <w:rPr>
+                <w:color w:val="666666"/>
+                <w:sz w:val="16"/>
+              </w:rPr>
+              <w:t xml:space="preserve">HOME-030</w:t>
+            </w:r>
+          </w:p>
+        </w:tc>
+        <w:tc>
+          <w:tcPr>
+            <w:tcW w:w="1800" w:type="dxa"/>
+          </w:tcPr>
+          <w:p>
+            <w:pPr>
+              <w:spacing w:after="60"/>
+            </w:pPr>
+            <w:r>
+              <w:rPr>
+                <w:color w:val="444444"/>
+                <w:sz w:val="18"/>
+              </w:rPr>
+              <w:t xml:space="preserve">Opsomming</w:t>
+            </w:r>
+          </w:p>
+        </w:tc>
+        <w:tc>
+          <w:tcPr>
+            <w:tcW w:w="5900" w:type="dxa"/>
+          </w:tcPr>
+          <w:p>
+            <w:pPr>
+              <w:spacing w:after="60"/>
+            </w:pPr>
+            <w:r>
+              <w:t xml:space="preserve">Everllence</w:t>
+            </w:r>
+          </w:p>
+        </w:tc>
+        <w:tc>
+          <w:tcPr>
+            <w:tcW w:w="5900" w:type="dxa"/>
+            <w:shd w:val="clear" w:color="auto" w:fill="FFFBEA"/>
+          </w:tcPr>
+          <w:p>
+            <w:pPr>
+              <w:spacing w:after="60"/>
+            </w:pPr>
+            <w:r>
+              <w:t xml:space="preserve"/>
+            </w:r>
+          </w:p>
+        </w:tc>
+      </w:tr>
+      <w:tr>
+        <w:trPr>
+          <w:cantSplit/>
+        </w:trPr>
+        <w:tc>
+          <w:tcPr>
+            <w:tcW w:w="1250" w:type="dxa"/>
+          </w:tcPr>
+          <w:p>
+            <w:pPr>
+              <w:spacing w:after="60"/>
+            </w:pPr>
+            <w:r>
+              <w:rPr>
+                <w:color w:val="666666"/>
+                <w:sz w:val="16"/>
+              </w:rPr>
+              <w:t xml:space="preserve">HOME-031</w:t>
+            </w:r>
+          </w:p>
+        </w:tc>
+        <w:tc>
+          <w:tcPr>
+            <w:tcW w:w="1800" w:type="dxa"/>
+          </w:tcPr>
+          <w:p>
+            <w:pPr>
+              <w:spacing w:after="60"/>
+            </w:pPr>
+            <w:r>
+              <w:rPr>
+                <w:color w:val="444444"/>
+                <w:sz w:val="18"/>
+              </w:rPr>
+              <w:t xml:space="preserve">Opsomming</w:t>
+            </w:r>
+          </w:p>
+        </w:tc>
+        <w:tc>
+          <w:tcPr>
+            <w:tcW w:w="5900" w:type="dxa"/>
+          </w:tcPr>
+          <w:p>
+            <w:pPr>
+              <w:spacing w:after="60"/>
+            </w:pPr>
+            <w:r>
+              <w:t xml:space="preserve">SOUDAL</w:t>
+            </w:r>
+          </w:p>
+        </w:tc>
+        <w:tc>
+          <w:tcPr>
+            <w:tcW w:w="5900" w:type="dxa"/>
+            <w:shd w:val="clear" w:color="auto" w:fill="FFFBEA"/>
+          </w:tcPr>
+          <w:p>
+            <w:pPr>
+              <w:spacing w:after="60"/>
+            </w:pPr>
+            <w:r>
+              <w:t xml:space="preserve"/>
+            </w:r>
+          </w:p>
+        </w:tc>
+      </w:tr>
+      <w:tr>
+        <w:trPr>
+          <w:cantSplit/>
+        </w:trPr>
+        <w:tc>
+          <w:tcPr>
+            <w:tcW w:w="1250" w:type="dxa"/>
+          </w:tcPr>
+          <w:p>
+            <w:pPr>
+              <w:spacing w:after="60"/>
+            </w:pPr>
+            <w:r>
+              <w:rPr>
+                <w:color w:val="666666"/>
+                <w:sz w:val="16"/>
+              </w:rPr>
+              <w:t xml:space="preserve">HOME-032</w:t>
+            </w:r>
+          </w:p>
+        </w:tc>
+        <w:tc>
+          <w:tcPr>
+            <w:tcW w:w="1800" w:type="dxa"/>
+          </w:tcPr>
+          <w:p>
+            <w:pPr>
+              <w:spacing w:after="60"/>
+            </w:pPr>
+            <w:r>
+              <w:rPr>
+                <w:color w:val="444444"/>
+                <w:sz w:val="18"/>
+              </w:rPr>
+              <w:t xml:space="preserve">Opsomming</w:t>
+            </w:r>
+          </w:p>
+        </w:tc>
+        <w:tc>
+          <w:tcPr>
+            <w:tcW w:w="5900" w:type="dxa"/>
+          </w:tcPr>
+          <w:p>
+            <w:pPr>
+              <w:spacing w:after="60"/>
+            </w:pPr>
+            <w:r>
+              <w:t xml:space="preserve">Aurubis</w:t>
+            </w:r>
+          </w:p>
+        </w:tc>
+        <w:tc>
+          <w:tcPr>
+            <w:tcW w:w="5900" w:type="dxa"/>
+            <w:shd w:val="clear" w:color="auto" w:fill="FFFBEA"/>
+          </w:tcPr>
+          <w:p>
+            <w:pPr>
+              <w:spacing w:after="60"/>
+            </w:pPr>
+            <w:r>
+              <w:t xml:space="preserve"/>
+            </w:r>
+          </w:p>
+        </w:tc>
+      </w:tr>
+      <w:tr>
+        <w:trPr>
+          <w:cantSplit/>
+        </w:trPr>
+        <w:tc>
+          <w:tcPr>
+            <w:tcW w:w="1250" w:type="dxa"/>
+          </w:tcPr>
+          <w:p>
+            <w:pPr>
+              <w:spacing w:after="60"/>
+            </w:pPr>
+            <w:r>
+              <w:rPr>
+                <w:color w:val="666666"/>
+                <w:sz w:val="16"/>
+              </w:rPr>
+              <w:t xml:space="preserve">HOME-033</w:t>
+            </w:r>
+          </w:p>
+        </w:tc>
+        <w:tc>
+          <w:tcPr>
+            <w:tcW w:w="1800" w:type="dxa"/>
+          </w:tcPr>
+          <w:p>
+            <w:pPr>
+              <w:spacing w:after="60"/>
+            </w:pPr>
+            <w:r>
+              <w:rPr>
+                <w:color w:val="444444"/>
+                <w:sz w:val="18"/>
+              </w:rPr>
+              <w:t xml:space="preserve">Opsomming</w:t>
+            </w:r>
+          </w:p>
+        </w:tc>
+        <w:tc>
+          <w:tcPr>
+            <w:tcW w:w="5900" w:type="dxa"/>
+          </w:tcPr>
+          <w:p>
+            <w:pPr>
+              <w:spacing w:after="60"/>
+            </w:pPr>
+            <w:r>
+              <w:t xml:space="preserve">ENGIE</w:t>
+            </w:r>
+          </w:p>
+        </w:tc>
+        <w:tc>
+          <w:tcPr>
+            <w:tcW w:w="5900" w:type="dxa"/>
+            <w:shd w:val="clear" w:color="auto" w:fill="FFFBEA"/>
+          </w:tcPr>
+          <w:p>
+            <w:pPr>
+              <w:spacing w:after="60"/>
+            </w:pPr>
+            <w:r>
+              <w:t xml:space="preserve"/>
+            </w:r>
+          </w:p>
+        </w:tc>
+      </w:tr>
+      <w:tr>
+        <w:trPr>
+          <w:cantSplit/>
+        </w:trPr>
+        <w:tc>
+          <w:tcPr>
+            <w:tcW w:w="1250" w:type="dxa"/>
+          </w:tcPr>
+          <w:p>
+            <w:pPr>
+              <w:spacing w:after="60"/>
+            </w:pPr>
+            <w:r>
+              <w:rPr>
+                <w:color w:val="666666"/>
+                <w:sz w:val="16"/>
+              </w:rPr>
+              <w:t xml:space="preserve">HOME-034</w:t>
+            </w:r>
+          </w:p>
+        </w:tc>
+        <w:tc>
+          <w:tcPr>
+            <w:tcW w:w="1800" w:type="dxa"/>
+          </w:tcPr>
+          <w:p>
+            <w:pPr>
+              <w:spacing w:after="60"/>
+            </w:pPr>
+            <w:r>
+              <w:rPr>
+                <w:color w:val="444444"/>
+                <w:sz w:val="18"/>
+              </w:rPr>
+              <w:t xml:space="preserve">Opsomming</w:t>
+            </w:r>
+          </w:p>
+        </w:tc>
+        <w:tc>
+          <w:tcPr>
+            <w:tcW w:w="5900" w:type="dxa"/>
+          </w:tcPr>
+          <w:p>
+            <w:pPr>
+              <w:spacing w:after="60"/>
+            </w:pPr>
+            <w:r>
               <w:t xml:space="preserve">KOMATSU</w:t>
             </w:r>
           </w:p>
@@ -1972,7 +2434,7 @@
                 <w:color w:val="666666"/>
                 <w:sz w:val="16"/>
               </w:rPr>
-              <w:t xml:space="preserve">HOME-028</w:t>
+              <w:t xml:space="preserve">HOME-035</w:t>
             </w:r>
           </w:p>
         </w:tc>
@@ -2002,43 +2464,43 @@
               <w:spacing w:after="60"/>
             </w:pPr>
             <w:r>
-              <w:t xml:space="preserve">Yokohama</w:t>
-            </w:r>
-          </w:p>
-        </w:tc>
-        <w:tc>
-          <w:tcPr>
-            <w:tcW w:w="5900" w:type="dxa"/>
-            <w:shd w:val="clear" w:color="auto" w:fill="FFFBEA"/>
-          </w:tcPr>
-          <w:p>
-            <w:pPr>
-              <w:spacing w:after="60"/>
-            </w:pPr>
-            <w:r>
-              <w:t xml:space="preserve"/>
-            </w:r>
-          </w:p>
-        </w:tc>
-      </w:tr>
-      <w:tr>
-        <w:trPr>
-          <w:cantSplit/>
-        </w:trPr>
-        <w:tc>
-          <w:tcPr>
-            <w:tcW w:w="1250" w:type="dxa"/>
-          </w:tcPr>
-          <w:p>
-            <w:pPr>
-              <w:spacing w:after="60"/>
-            </w:pPr>
-            <w:r>
-              <w:rPr>
-                <w:color w:val="666666"/>
-                <w:sz w:val="16"/>
-              </w:rPr>
-              <w:t xml:space="preserve">HOME-029</w:t>
+              <w:t xml:space="preserve">Battenfeld</w:t>
+            </w:r>
+          </w:p>
+        </w:tc>
+        <w:tc>
+          <w:tcPr>
+            <w:tcW w:w="5900" w:type="dxa"/>
+            <w:shd w:val="clear" w:color="auto" w:fill="FFFBEA"/>
+          </w:tcPr>
+          <w:p>
+            <w:pPr>
+              <w:spacing w:after="60"/>
+            </w:pPr>
+            <w:r>
+              <w:t xml:space="preserve"/>
+            </w:r>
+          </w:p>
+        </w:tc>
+      </w:tr>
+      <w:tr>
+        <w:trPr>
+          <w:cantSplit/>
+        </w:trPr>
+        <w:tc>
+          <w:tcPr>
+            <w:tcW w:w="1250" w:type="dxa"/>
+          </w:tcPr>
+          <w:p>
+            <w:pPr>
+              <w:spacing w:after="60"/>
+            </w:pPr>
+            <w:r>
+              <w:rPr>
+                <w:color w:val="666666"/>
+                <w:sz w:val="16"/>
+              </w:rPr>
+              <w:t xml:space="preserve">HOME-036</w:t>
             </w:r>
           </w:p>
         </w:tc>
@@ -2104,7 +2566,7 @@
                 <w:color w:val="666666"/>
                 <w:sz w:val="16"/>
               </w:rPr>
-              <w:t xml:space="preserve">HOME-030</w:t>
+              <w:t xml:space="preserve">HOME-037</w:t>
             </w:r>
           </w:p>
         </w:tc>
@@ -2170,7 +2632,7 @@
                 <w:color w:val="666666"/>
                 <w:sz w:val="16"/>
               </w:rPr>
-              <w:t xml:space="preserve">HOME-031</w:t>
+              <w:t xml:space="preserve">HOME-038</w:t>
             </w:r>
           </w:p>
         </w:tc>
@@ -2236,7 +2698,7 @@
                 <w:color w:val="666666"/>
                 <w:sz w:val="16"/>
               </w:rPr>
-              <w:t xml:space="preserve">HOME-032</w:t>
+              <w:t xml:space="preserve">HOME-039</w:t>
             </w:r>
           </w:p>
         </w:tc>
@@ -2302,7 +2764,7 @@
                 <w:color w:val="666666"/>
                 <w:sz w:val="16"/>
               </w:rPr>
-              <w:t xml:space="preserve">HOME-033</w:t>
+              <w:t xml:space="preserve">HOME-040</w:t>
             </w:r>
           </w:p>
         </w:tc>
@@ -2333,6 +2795,468 @@
             </w:pPr>
             <w:r>
               <w:t xml:space="preserve">Castrol</w:t>
+            </w:r>
+          </w:p>
+        </w:tc>
+        <w:tc>
+          <w:tcPr>
+            <w:tcW w:w="5900" w:type="dxa"/>
+            <w:shd w:val="clear" w:color="auto" w:fill="FFFBEA"/>
+          </w:tcPr>
+          <w:p>
+            <w:pPr>
+              <w:spacing w:after="60"/>
+            </w:pPr>
+            <w:r>
+              <w:t xml:space="preserve"/>
+            </w:r>
+          </w:p>
+        </w:tc>
+      </w:tr>
+      <w:tr>
+        <w:trPr>
+          <w:cantSplit/>
+        </w:trPr>
+        <w:tc>
+          <w:tcPr>
+            <w:tcW w:w="1250" w:type="dxa"/>
+          </w:tcPr>
+          <w:p>
+            <w:pPr>
+              <w:spacing w:after="60"/>
+            </w:pPr>
+            <w:r>
+              <w:rPr>
+                <w:color w:val="666666"/>
+                <w:sz w:val="16"/>
+              </w:rPr>
+              <w:t xml:space="preserve">HOME-041</w:t>
+            </w:r>
+          </w:p>
+        </w:tc>
+        <w:tc>
+          <w:tcPr>
+            <w:tcW w:w="1800" w:type="dxa"/>
+          </w:tcPr>
+          <w:p>
+            <w:pPr>
+              <w:spacing w:after="60"/>
+            </w:pPr>
+            <w:r>
+              <w:rPr>
+                <w:color w:val="444444"/>
+                <w:sz w:val="18"/>
+              </w:rPr>
+              <w:t xml:space="preserve">Opsomming</w:t>
+            </w:r>
+          </w:p>
+        </w:tc>
+        <w:tc>
+          <w:tcPr>
+            <w:tcW w:w="5900" w:type="dxa"/>
+          </w:tcPr>
+          <w:p>
+            <w:pPr>
+              <w:spacing w:after="60"/>
+            </w:pPr>
+            <w:r>
+              <w:t xml:space="preserve">Equans</w:t>
+            </w:r>
+          </w:p>
+        </w:tc>
+        <w:tc>
+          <w:tcPr>
+            <w:tcW w:w="5900" w:type="dxa"/>
+            <w:shd w:val="clear" w:color="auto" w:fill="FFFBEA"/>
+          </w:tcPr>
+          <w:p>
+            <w:pPr>
+              <w:spacing w:after="60"/>
+            </w:pPr>
+            <w:r>
+              <w:t xml:space="preserve"/>
+            </w:r>
+          </w:p>
+        </w:tc>
+      </w:tr>
+      <w:tr>
+        <w:trPr>
+          <w:cantSplit/>
+        </w:trPr>
+        <w:tc>
+          <w:tcPr>
+            <w:tcW w:w="1250" w:type="dxa"/>
+          </w:tcPr>
+          <w:p>
+            <w:pPr>
+              <w:spacing w:after="60"/>
+            </w:pPr>
+            <w:r>
+              <w:rPr>
+                <w:color w:val="666666"/>
+                <w:sz w:val="16"/>
+              </w:rPr>
+              <w:t xml:space="preserve">HOME-042</w:t>
+            </w:r>
+          </w:p>
+        </w:tc>
+        <w:tc>
+          <w:tcPr>
+            <w:tcW w:w="1800" w:type="dxa"/>
+          </w:tcPr>
+          <w:p>
+            <w:pPr>
+              <w:spacing w:after="60"/>
+            </w:pPr>
+            <w:r>
+              <w:rPr>
+                <w:color w:val="444444"/>
+                <w:sz w:val="18"/>
+              </w:rPr>
+              <w:t xml:space="preserve">Opsomming</w:t>
+            </w:r>
+          </w:p>
+        </w:tc>
+        <w:tc>
+          <w:tcPr>
+            <w:tcW w:w="5900" w:type="dxa"/>
+          </w:tcPr>
+          <w:p>
+            <w:pPr>
+              <w:spacing w:after="60"/>
+            </w:pPr>
+            <w:r>
+              <w:t xml:space="preserve">Ferrari</w:t>
+            </w:r>
+          </w:p>
+        </w:tc>
+        <w:tc>
+          <w:tcPr>
+            <w:tcW w:w="5900" w:type="dxa"/>
+            <w:shd w:val="clear" w:color="auto" w:fill="FFFBEA"/>
+          </w:tcPr>
+          <w:p>
+            <w:pPr>
+              <w:spacing w:after="60"/>
+            </w:pPr>
+            <w:r>
+              <w:t xml:space="preserve"/>
+            </w:r>
+          </w:p>
+        </w:tc>
+      </w:tr>
+      <w:tr>
+        <w:trPr>
+          <w:cantSplit/>
+        </w:trPr>
+        <w:tc>
+          <w:tcPr>
+            <w:tcW w:w="1250" w:type="dxa"/>
+          </w:tcPr>
+          <w:p>
+            <w:pPr>
+              <w:spacing w:after="60"/>
+            </w:pPr>
+            <w:r>
+              <w:rPr>
+                <w:color w:val="666666"/>
+                <w:sz w:val="16"/>
+              </w:rPr>
+              <w:t xml:space="preserve">HOME-043</w:t>
+            </w:r>
+          </w:p>
+        </w:tc>
+        <w:tc>
+          <w:tcPr>
+            <w:tcW w:w="1800" w:type="dxa"/>
+          </w:tcPr>
+          <w:p>
+            <w:pPr>
+              <w:spacing w:after="60"/>
+            </w:pPr>
+            <w:r>
+              <w:rPr>
+                <w:color w:val="444444"/>
+                <w:sz w:val="18"/>
+              </w:rPr>
+              <w:t xml:space="preserve">Opsomming</w:t>
+            </w:r>
+          </w:p>
+        </w:tc>
+        <w:tc>
+          <w:tcPr>
+            <w:tcW w:w="5900" w:type="dxa"/>
+          </w:tcPr>
+          <w:p>
+            <w:pPr>
+              <w:spacing w:after="60"/>
+            </w:pPr>
+            <w:r>
+              <w:t xml:space="preserve">Apiroc</w:t>
+            </w:r>
+          </w:p>
+        </w:tc>
+        <w:tc>
+          <w:tcPr>
+            <w:tcW w:w="5900" w:type="dxa"/>
+            <w:shd w:val="clear" w:color="auto" w:fill="FFFBEA"/>
+          </w:tcPr>
+          <w:p>
+            <w:pPr>
+              <w:spacing w:after="60"/>
+            </w:pPr>
+            <w:r>
+              <w:t xml:space="preserve"/>
+            </w:r>
+          </w:p>
+        </w:tc>
+      </w:tr>
+      <w:tr>
+        <w:trPr>
+          <w:cantSplit/>
+        </w:trPr>
+        <w:tc>
+          <w:tcPr>
+            <w:tcW w:w="1250" w:type="dxa"/>
+          </w:tcPr>
+          <w:p>
+            <w:pPr>
+              <w:spacing w:after="60"/>
+            </w:pPr>
+            <w:r>
+              <w:rPr>
+                <w:color w:val="666666"/>
+                <w:sz w:val="16"/>
+              </w:rPr>
+              <w:t xml:space="preserve">HOME-044</w:t>
+            </w:r>
+          </w:p>
+        </w:tc>
+        <w:tc>
+          <w:tcPr>
+            <w:tcW w:w="1800" w:type="dxa"/>
+          </w:tcPr>
+          <w:p>
+            <w:pPr>
+              <w:spacing w:after="60"/>
+            </w:pPr>
+            <w:r>
+              <w:rPr>
+                <w:color w:val="444444"/>
+                <w:sz w:val="18"/>
+              </w:rPr>
+              <w:t xml:space="preserve">Opsomming</w:t>
+            </w:r>
+          </w:p>
+        </w:tc>
+        <w:tc>
+          <w:tcPr>
+            <w:tcW w:w="5900" w:type="dxa"/>
+          </w:tcPr>
+          <w:p>
+            <w:pPr>
+              <w:spacing w:after="60"/>
+            </w:pPr>
+            <w:r>
+              <w:t xml:space="preserve">Everllence</w:t>
+            </w:r>
+          </w:p>
+        </w:tc>
+        <w:tc>
+          <w:tcPr>
+            <w:tcW w:w="5900" w:type="dxa"/>
+            <w:shd w:val="clear" w:color="auto" w:fill="FFFBEA"/>
+          </w:tcPr>
+          <w:p>
+            <w:pPr>
+              <w:spacing w:after="60"/>
+            </w:pPr>
+            <w:r>
+              <w:t xml:space="preserve"/>
+            </w:r>
+          </w:p>
+        </w:tc>
+      </w:tr>
+      <w:tr>
+        <w:trPr>
+          <w:cantSplit/>
+        </w:trPr>
+        <w:tc>
+          <w:tcPr>
+            <w:tcW w:w="1250" w:type="dxa"/>
+          </w:tcPr>
+          <w:p>
+            <w:pPr>
+              <w:spacing w:after="60"/>
+            </w:pPr>
+            <w:r>
+              <w:rPr>
+                <w:color w:val="666666"/>
+                <w:sz w:val="16"/>
+              </w:rPr>
+              <w:t xml:space="preserve">HOME-045</w:t>
+            </w:r>
+          </w:p>
+        </w:tc>
+        <w:tc>
+          <w:tcPr>
+            <w:tcW w:w="1800" w:type="dxa"/>
+          </w:tcPr>
+          <w:p>
+            <w:pPr>
+              <w:spacing w:after="60"/>
+            </w:pPr>
+            <w:r>
+              <w:rPr>
+                <w:color w:val="444444"/>
+                <w:sz w:val="18"/>
+              </w:rPr>
+              <w:t xml:space="preserve">Opsomming</w:t>
+            </w:r>
+          </w:p>
+        </w:tc>
+        <w:tc>
+          <w:tcPr>
+            <w:tcW w:w="5900" w:type="dxa"/>
+          </w:tcPr>
+          <w:p>
+            <w:pPr>
+              <w:spacing w:after="60"/>
+            </w:pPr>
+            <w:r>
+              <w:t xml:space="preserve">SOUDAL</w:t>
+            </w:r>
+          </w:p>
+        </w:tc>
+        <w:tc>
+          <w:tcPr>
+            <w:tcW w:w="5900" w:type="dxa"/>
+            <w:shd w:val="clear" w:color="auto" w:fill="FFFBEA"/>
+          </w:tcPr>
+          <w:p>
+            <w:pPr>
+              <w:spacing w:after="60"/>
+            </w:pPr>
+            <w:r>
+              <w:t xml:space="preserve"/>
+            </w:r>
+          </w:p>
+        </w:tc>
+      </w:tr>
+      <w:tr>
+        <w:trPr>
+          <w:cantSplit/>
+        </w:trPr>
+        <w:tc>
+          <w:tcPr>
+            <w:tcW w:w="1250" w:type="dxa"/>
+          </w:tcPr>
+          <w:p>
+            <w:pPr>
+              <w:spacing w:after="60"/>
+            </w:pPr>
+            <w:r>
+              <w:rPr>
+                <w:color w:val="666666"/>
+                <w:sz w:val="16"/>
+              </w:rPr>
+              <w:t xml:space="preserve">HOME-046</w:t>
+            </w:r>
+          </w:p>
+        </w:tc>
+        <w:tc>
+          <w:tcPr>
+            <w:tcW w:w="1800" w:type="dxa"/>
+          </w:tcPr>
+          <w:p>
+            <w:pPr>
+              <w:spacing w:after="60"/>
+            </w:pPr>
+            <w:r>
+              <w:rPr>
+                <w:color w:val="444444"/>
+                <w:sz w:val="18"/>
+              </w:rPr>
+              <w:t xml:space="preserve">Opsomming</w:t>
+            </w:r>
+          </w:p>
+        </w:tc>
+        <w:tc>
+          <w:tcPr>
+            <w:tcW w:w="5900" w:type="dxa"/>
+          </w:tcPr>
+          <w:p>
+            <w:pPr>
+              <w:spacing w:after="60"/>
+            </w:pPr>
+            <w:r>
+              <w:t xml:space="preserve">Aurubis</w:t>
+            </w:r>
+          </w:p>
+        </w:tc>
+        <w:tc>
+          <w:tcPr>
+            <w:tcW w:w="5900" w:type="dxa"/>
+            <w:shd w:val="clear" w:color="auto" w:fill="FFFBEA"/>
+          </w:tcPr>
+          <w:p>
+            <w:pPr>
+              <w:spacing w:after="60"/>
+            </w:pPr>
+            <w:r>
+              <w:t xml:space="preserve"/>
+            </w:r>
+          </w:p>
+        </w:tc>
+      </w:tr>
+      <w:tr>
+        <w:trPr>
+          <w:cantSplit/>
+        </w:trPr>
+        <w:tc>
+          <w:tcPr>
+            <w:tcW w:w="1250" w:type="dxa"/>
+          </w:tcPr>
+          <w:p>
+            <w:pPr>
+              <w:spacing w:after="60"/>
+            </w:pPr>
+            <w:r>
+              <w:rPr>
+                <w:color w:val="666666"/>
+                <w:sz w:val="16"/>
+              </w:rPr>
+              <w:t xml:space="preserve">HOME-047</w:t>
+            </w:r>
+          </w:p>
+        </w:tc>
+        <w:tc>
+          <w:tcPr>
+            <w:tcW w:w="1800" w:type="dxa"/>
+          </w:tcPr>
+          <w:p>
+            <w:pPr>
+              <w:spacing w:after="60"/>
+            </w:pPr>
+            <w:r>
+              <w:rPr>
+                <w:color w:val="444444"/>
+                <w:sz w:val="18"/>
+              </w:rPr>
+              <w:t xml:space="preserve">Opsomming</w:t>
+            </w:r>
+          </w:p>
+        </w:tc>
+        <w:tc>
+          <w:tcPr>
+            <w:tcW w:w="5900" w:type="dxa"/>
+          </w:tcPr>
+          <w:p>
+            <w:pPr>
+              <w:spacing w:after="60"/>
+            </w:pPr>
+            <w:r>
+              <w:t xml:space="preserve">ENGIE</w:t>
             </w:r>
           </w:p>
         </w:tc>
@@ -2367,29 +3291,29 @@
                 <w:b/>
                 <w:color w:val="0E0B24"/>
               </w:rPr>
-              <w:t xml:space="preserve">Blok: Eén filterelement tegen vier soorten vervuiling</w:t>
-            </w:r>
-          </w:p>
-        </w:tc>
-      </w:tr>
-      <w:tr>
-        <w:trPr>
-          <w:cantSplit/>
-        </w:trPr>
-        <w:tc>
-          <w:tcPr>
-            <w:tcW w:w="1250" w:type="dxa"/>
-          </w:tcPr>
-          <w:p>
-            <w:pPr>
-              <w:spacing w:after="60"/>
-            </w:pPr>
-            <w:r>
-              <w:rPr>
-                <w:color w:val="666666"/>
-                <w:sz w:val="16"/>
-              </w:rPr>
-              <w:t xml:space="preserve">HOME-034</w:t>
+              <w:t xml:space="preserve">Blok: Eén filterelement tegen drie soorten vervuiling</w:t>
+            </w:r>
+          </w:p>
+        </w:tc>
+      </w:tr>
+      <w:tr>
+        <w:trPr>
+          <w:cantSplit/>
+        </w:trPr>
+        <w:tc>
+          <w:tcPr>
+            <w:tcW w:w="1250" w:type="dxa"/>
+          </w:tcPr>
+          <w:p>
+            <w:pPr>
+              <w:spacing w:after="60"/>
+            </w:pPr>
+            <w:r>
+              <w:rPr>
+                <w:color w:val="666666"/>
+                <w:sz w:val="16"/>
+              </w:rPr>
+              <w:t xml:space="preserve">HOME-048</w:t>
             </w:r>
           </w:p>
         </w:tc>
@@ -2419,43 +3343,43 @@
               <w:spacing w:after="60"/>
             </w:pPr>
             <w:r>
-              <w:t xml:space="preserve">Eén filterelement tegen vier soorten vervuiling</w:t>
-            </w:r>
-          </w:p>
-        </w:tc>
-        <w:tc>
-          <w:tcPr>
-            <w:tcW w:w="5900" w:type="dxa"/>
-            <w:shd w:val="clear" w:color="auto" w:fill="FFFBEA"/>
-          </w:tcPr>
-          <w:p>
-            <w:pPr>
-              <w:spacing w:after="60"/>
-            </w:pPr>
-            <w:r>
-              <w:t xml:space="preserve"/>
-            </w:r>
-          </w:p>
-        </w:tc>
-      </w:tr>
-      <w:tr>
-        <w:trPr>
-          <w:cantSplit/>
-        </w:trPr>
-        <w:tc>
-          <w:tcPr>
-            <w:tcW w:w="1250" w:type="dxa"/>
-          </w:tcPr>
-          <w:p>
-            <w:pPr>
-              <w:spacing w:after="60"/>
-            </w:pPr>
-            <w:r>
-              <w:rPr>
-                <w:color w:val="666666"/>
-                <w:sz w:val="16"/>
-              </w:rPr>
-              <w:t xml:space="preserve">HOME-035</w:t>
+              <w:t xml:space="preserve">Eén filterelement tegen drie soorten vervuiling</w:t>
+            </w:r>
+          </w:p>
+        </w:tc>
+        <w:tc>
+          <w:tcPr>
+            <w:tcW w:w="5900" w:type="dxa"/>
+            <w:shd w:val="clear" w:color="auto" w:fill="FFFBEA"/>
+          </w:tcPr>
+          <w:p>
+            <w:pPr>
+              <w:spacing w:after="60"/>
+            </w:pPr>
+            <w:r>
+              <w:t xml:space="preserve"/>
+            </w:r>
+          </w:p>
+        </w:tc>
+      </w:tr>
+      <w:tr>
+        <w:trPr>
+          <w:cantSplit/>
+        </w:trPr>
+        <w:tc>
+          <w:tcPr>
+            <w:tcW w:w="1250" w:type="dxa"/>
+          </w:tcPr>
+          <w:p>
+            <w:pPr>
+              <w:spacing w:after="60"/>
+            </w:pPr>
+            <w:r>
+              <w:rPr>
+                <w:color w:val="666666"/>
+                <w:sz w:val="16"/>
+              </w:rPr>
+              <w:t xml:space="preserve">HOME-049</w:t>
             </w:r>
           </w:p>
         </w:tc>
@@ -2521,7 +3445,7 @@
                 <w:color w:val="666666"/>
                 <w:sz w:val="16"/>
               </w:rPr>
-              <w:t xml:space="preserve">HOME-036</w:t>
+              <w:t xml:space="preserve">HOME-050</w:t>
             </w:r>
           </w:p>
         </w:tc>
@@ -2587,7 +3511,7 @@
                 <w:color w:val="666666"/>
                 <w:sz w:val="16"/>
               </w:rPr>
-              <w:t xml:space="preserve">HOME-037</w:t>
+              <w:t xml:space="preserve">HOME-051</w:t>
             </w:r>
           </w:p>
         </w:tc>
@@ -2653,7 +3577,7 @@
                 <w:color w:val="666666"/>
                 <w:sz w:val="16"/>
               </w:rPr>
-              <w:t xml:space="preserve">HOME-038</w:t>
+              <w:t xml:space="preserve">HOME-052</w:t>
             </w:r>
           </w:p>
         </w:tc>
@@ -2719,7 +3643,7 @@
                 <w:color w:val="666666"/>
                 <w:sz w:val="16"/>
               </w:rPr>
-              <w:t xml:space="preserve">HOME-039</w:t>
+              <w:t xml:space="preserve">HOME-053</w:t>
             </w:r>
           </w:p>
         </w:tc>
@@ -2785,7 +3709,7 @@
                 <w:color w:val="666666"/>
                 <w:sz w:val="16"/>
               </w:rPr>
-              <w:t xml:space="preserve">HOME-040</w:t>
+              <w:t xml:space="preserve">HOME-054</w:t>
             </w:r>
           </w:p>
         </w:tc>
@@ -2851,7 +3775,7 @@
                 <w:color w:val="666666"/>
                 <w:sz w:val="16"/>
               </w:rPr>
-              <w:t xml:space="preserve">HOME-041</w:t>
+              <w:t xml:space="preserve">HOME-055</w:t>
             </w:r>
           </w:p>
         </w:tc>
@@ -2917,7 +3841,7 @@
                 <w:color w:val="666666"/>
                 <w:sz w:val="16"/>
               </w:rPr>
-              <w:t xml:space="preserve">HOME-042</w:t>
+              <w:t xml:space="preserve">HOME-056</w:t>
             </w:r>
           </w:p>
         </w:tc>
@@ -2983,7 +3907,7 @@
                 <w:color w:val="666666"/>
                 <w:sz w:val="16"/>
               </w:rPr>
-              <w:t xml:space="preserve">HOME-043</w:t>
+              <w:t xml:space="preserve">HOME-057</w:t>
             </w:r>
           </w:p>
         </w:tc>
@@ -3049,7 +3973,7 @@
                 <w:color w:val="666666"/>
                 <w:sz w:val="16"/>
               </w:rPr>
-              <w:t xml:space="preserve">HOME-044</w:t>
+              <w:t xml:space="preserve">HOME-058</w:t>
             </w:r>
           </w:p>
         </w:tc>
@@ -3115,7 +4039,7 @@
                 <w:color w:val="666666"/>
                 <w:sz w:val="16"/>
               </w:rPr>
-              <w:t xml:space="preserve">HOME-045</w:t>
+              <w:t xml:space="preserve">HOME-059</w:t>
             </w:r>
           </w:p>
         </w:tc>
@@ -3181,7 +4105,7 @@
                 <w:color w:val="666666"/>
                 <w:sz w:val="16"/>
               </w:rPr>
-              <w:t xml:space="preserve">HOME-046</w:t>
+              <w:t xml:space="preserve">HOME-060</w:t>
             </w:r>
           </w:p>
         </w:tc>
@@ -3247,7 +4171,7 @@
                 <w:color w:val="666666"/>
                 <w:sz w:val="16"/>
               </w:rPr>
-              <w:t xml:space="preserve">HOME-047</w:t>
+              <w:t xml:space="preserve">HOME-061</w:t>
             </w:r>
           </w:p>
         </w:tc>
@@ -3334,7 +4258,7 @@
                 <w:color w:val="666666"/>
                 <w:sz w:val="16"/>
               </w:rPr>
-              <w:t xml:space="preserve">HOME-048</w:t>
+              <w:t xml:space="preserve">HOME-062</w:t>
             </w:r>
           </w:p>
         </w:tc>
@@ -3400,7 +4324,7 @@
                 <w:color w:val="666666"/>
                 <w:sz w:val="16"/>
               </w:rPr>
-              <w:t xml:space="preserve">HOME-049</w:t>
+              <w:t xml:space="preserve">HOME-063</w:t>
             </w:r>
           </w:p>
         </w:tc>
@@ -3466,7 +4390,7 @@
                 <w:color w:val="666666"/>
                 <w:sz w:val="16"/>
               </w:rPr>
-              <w:t xml:space="preserve">HOME-050</w:t>
+              <w:t xml:space="preserve">HOME-064</w:t>
             </w:r>
           </w:p>
         </w:tc>
@@ -3532,7 +4456,7 @@
                 <w:color w:val="666666"/>
                 <w:sz w:val="16"/>
               </w:rPr>
-              <w:t xml:space="preserve">HOME-051</w:t>
+              <w:t xml:space="preserve">HOME-065</w:t>
             </w:r>
           </w:p>
         </w:tc>
@@ -3598,7 +4522,7 @@
                 <w:color w:val="666666"/>
                 <w:sz w:val="16"/>
               </w:rPr>
-              <w:t xml:space="preserve">HOME-052</w:t>
+              <w:t xml:space="preserve">HOME-066</w:t>
             </w:r>
           </w:p>
         </w:tc>
@@ -3664,7 +4588,7 @@
                 <w:color w:val="666666"/>
                 <w:sz w:val="16"/>
               </w:rPr>
-              <w:t xml:space="preserve">HOME-053</w:t>
+              <w:t xml:space="preserve">HOME-067</w:t>
             </w:r>
           </w:p>
         </w:tc>
@@ -3730,7 +4654,7 @@
                 <w:color w:val="666666"/>
                 <w:sz w:val="16"/>
               </w:rPr>
-              <w:t xml:space="preserve">HOME-054</w:t>
+              <w:t xml:space="preserve">HOME-068</w:t>
             </w:r>
           </w:p>
         </w:tc>
@@ -3796,7 +4720,7 @@
                 <w:color w:val="666666"/>
                 <w:sz w:val="16"/>
               </w:rPr>
-              <w:t xml:space="preserve">HOME-055</w:t>
+              <w:t xml:space="preserve">HOME-069</w:t>
             </w:r>
           </w:p>
         </w:tc>
@@ -3862,7 +4786,7 @@
                 <w:color w:val="666666"/>
                 <w:sz w:val="16"/>
               </w:rPr>
-              <w:t xml:space="preserve">HOME-056</w:t>
+              <w:t xml:space="preserve">HOME-070</w:t>
             </w:r>
           </w:p>
         </w:tc>
@@ -3928,7 +4852,7 @@
                 <w:color w:val="666666"/>
                 <w:sz w:val="16"/>
               </w:rPr>
-              <w:t xml:space="preserve">HOME-057</w:t>
+              <w:t xml:space="preserve">HOME-071</w:t>
             </w:r>
           </w:p>
         </w:tc>
@@ -3994,7 +4918,7 @@
                 <w:color w:val="666666"/>
                 <w:sz w:val="16"/>
               </w:rPr>
-              <w:t xml:space="preserve">HOME-058</w:t>
+              <w:t xml:space="preserve">HOME-072</w:t>
             </w:r>
           </w:p>
         </w:tc>
@@ -4060,7 +4984,7 @@
                 <w:color w:val="666666"/>
                 <w:sz w:val="16"/>
               </w:rPr>
-              <w:t xml:space="preserve">HOME-059</w:t>
+              <w:t xml:space="preserve">HOME-073</w:t>
             </w:r>
           </w:p>
         </w:tc>
@@ -4126,7 +5050,7 @@
                 <w:color w:val="666666"/>
                 <w:sz w:val="16"/>
               </w:rPr>
-              <w:t xml:space="preserve">HOME-060</w:t>
+              <w:t xml:space="preserve">HOME-074</w:t>
             </w:r>
           </w:p>
         </w:tc>
@@ -4192,7 +5116,7 @@
                 <w:color w:val="666666"/>
                 <w:sz w:val="16"/>
               </w:rPr>
-              <w:t xml:space="preserve">HOME-061</w:t>
+              <w:t xml:space="preserve">HOME-075</w:t>
             </w:r>
           </w:p>
         </w:tc>
@@ -4258,7 +5182,7 @@
                 <w:color w:val="666666"/>
                 <w:sz w:val="16"/>
               </w:rPr>
-              <w:t xml:space="preserve">HOME-062</w:t>
+              <w:t xml:space="preserve">HOME-076</w:t>
             </w:r>
           </w:p>
         </w:tc>
@@ -4324,7 +5248,7 @@
                 <w:color w:val="666666"/>
                 <w:sz w:val="16"/>
               </w:rPr>
-              <w:t xml:space="preserve">HOME-063</w:t>
+              <w:t xml:space="preserve">HOME-077</w:t>
             </w:r>
           </w:p>
         </w:tc>
@@ -4390,7 +5314,7 @@
                 <w:color w:val="666666"/>
                 <w:sz w:val="16"/>
               </w:rPr>
-              <w:t xml:space="preserve">HOME-064</w:t>
+              <w:t xml:space="preserve">HOME-078</w:t>
             </w:r>
           </w:p>
         </w:tc>
@@ -4456,7 +5380,7 @@
                 <w:color w:val="666666"/>
                 <w:sz w:val="16"/>
               </w:rPr>
-              <w:t xml:space="preserve">HOME-065</w:t>
+              <w:t xml:space="preserve">HOME-079</w:t>
             </w:r>
           </w:p>
         </w:tc>
@@ -4522,7 +5446,7 @@
                 <w:color w:val="666666"/>
                 <w:sz w:val="16"/>
               </w:rPr>
-              <w:t xml:space="preserve">HOME-066</w:t>
+              <w:t xml:space="preserve">HOME-080</w:t>
             </w:r>
           </w:p>
         </w:tc>
@@ -4588,7 +5512,7 @@
                 <w:color w:val="666666"/>
                 <w:sz w:val="16"/>
               </w:rPr>
-              <w:t xml:space="preserve">HOME-067</w:t>
+              <w:t xml:space="preserve">HOME-081</w:t>
             </w:r>
           </w:p>
         </w:tc>
@@ -4654,7 +5578,7 @@
                 <w:color w:val="666666"/>
                 <w:sz w:val="16"/>
               </w:rPr>
-              <w:t xml:space="preserve">HOME-068</w:t>
+              <w:t xml:space="preserve">HOME-082</w:t>
             </w:r>
           </w:p>
         </w:tc>
@@ -4720,7 +5644,7 @@
                 <w:color w:val="666666"/>
                 <w:sz w:val="16"/>
               </w:rPr>
-              <w:t xml:space="preserve">HOME-069</w:t>
+              <w:t xml:space="preserve">HOME-083</w:t>
             </w:r>
           </w:p>
         </w:tc>
@@ -4786,7 +5710,7 @@
                 <w:color w:val="666666"/>
                 <w:sz w:val="16"/>
               </w:rPr>
-              <w:t xml:space="preserve">HOME-070</w:t>
+              <w:t xml:space="preserve">HOME-084</w:t>
             </w:r>
           </w:p>
         </w:tc>
@@ -4852,7 +5776,7 @@
                 <w:color w:val="666666"/>
                 <w:sz w:val="16"/>
               </w:rPr>
-              <w:t xml:space="preserve">HOME-071</w:t>
+              <w:t xml:space="preserve">HOME-085</w:t>
             </w:r>
           </w:p>
         </w:tc>
@@ -4918,7 +5842,7 @@
                 <w:color w:val="666666"/>
                 <w:sz w:val="16"/>
               </w:rPr>
-              <w:t xml:space="preserve">HOME-072</w:t>
+              <w:t xml:space="preserve">HOME-086</w:t>
             </w:r>
           </w:p>
         </w:tc>
@@ -4984,7 +5908,7 @@
                 <w:color w:val="666666"/>
                 <w:sz w:val="16"/>
               </w:rPr>
-              <w:t xml:space="preserve">HOME-073</w:t>
+              <w:t xml:space="preserve">HOME-087</w:t>
             </w:r>
           </w:p>
         </w:tc>
@@ -5050,7 +5974,7 @@
                 <w:color w:val="666666"/>
                 <w:sz w:val="16"/>
               </w:rPr>
-              <w:t xml:space="preserve">HOME-074</w:t>
+              <w:t xml:space="preserve">HOME-088</w:t>
             </w:r>
           </w:p>
         </w:tc>
@@ -5080,43 +6004,43 @@
               <w:spacing w:after="60"/>
             </w:pPr>
             <w:r>
-              <w:t xml:space="preserve">Triple R-vacuümontwateraar</w:t>
-            </w:r>
-          </w:p>
-        </w:tc>
-        <w:tc>
-          <w:tcPr>
-            <w:tcW w:w="5900" w:type="dxa"/>
-            <w:shd w:val="clear" w:color="auto" w:fill="FFFBEA"/>
-          </w:tcPr>
-          <w:p>
-            <w:pPr>
-              <w:spacing w:after="60"/>
-            </w:pPr>
-            <w:r>
-              <w:t xml:space="preserve"/>
-            </w:r>
-          </w:p>
-        </w:tc>
-      </w:tr>
-      <w:tr>
-        <w:trPr>
-          <w:cantSplit/>
-        </w:trPr>
-        <w:tc>
-          <w:tcPr>
-            <w:tcW w:w="1250" w:type="dxa"/>
-          </w:tcPr>
-          <w:p>
-            <w:pPr>
-              <w:spacing w:after="60"/>
-            </w:pPr>
-            <w:r>
-              <w:rPr>
-                <w:color w:val="666666"/>
-                <w:sz w:val="16"/>
-              </w:rPr>
-              <w:t xml:space="preserve">HOME-075</w:t>
+              <w:t xml:space="preserve">Triple R-vacuümdroger</w:t>
+            </w:r>
+          </w:p>
+        </w:tc>
+        <w:tc>
+          <w:tcPr>
+            <w:tcW w:w="5900" w:type="dxa"/>
+            <w:shd w:val="clear" w:color="auto" w:fill="FFFBEA"/>
+          </w:tcPr>
+          <w:p>
+            <w:pPr>
+              <w:spacing w:after="60"/>
+            </w:pPr>
+            <w:r>
+              <w:t xml:space="preserve"/>
+            </w:r>
+          </w:p>
+        </w:tc>
+      </w:tr>
+      <w:tr>
+        <w:trPr>
+          <w:cantSplit/>
+        </w:trPr>
+        <w:tc>
+          <w:tcPr>
+            <w:tcW w:w="1250" w:type="dxa"/>
+          </w:tcPr>
+          <w:p>
+            <w:pPr>
+              <w:spacing w:after="60"/>
+            </w:pPr>
+            <w:r>
+              <w:rPr>
+                <w:color w:val="666666"/>
+                <w:sz w:val="16"/>
+              </w:rPr>
+              <w:t xml:space="preserve">HOME-089</w:t>
             </w:r>
           </w:p>
         </w:tc>
@@ -5146,43 +6070,43 @@
               <w:spacing w:after="60"/>
             </w:pPr>
             <w:r>
-              <w:t xml:space="preserve">Vacuümontwateraar</w:t>
-            </w:r>
-          </w:p>
-        </w:tc>
-        <w:tc>
-          <w:tcPr>
-            <w:tcW w:w="5900" w:type="dxa"/>
-            <w:shd w:val="clear" w:color="auto" w:fill="FFFBEA"/>
-          </w:tcPr>
-          <w:p>
-            <w:pPr>
-              <w:spacing w:after="60"/>
-            </w:pPr>
-            <w:r>
-              <w:t xml:space="preserve"/>
-            </w:r>
-          </w:p>
-        </w:tc>
-      </w:tr>
-      <w:tr>
-        <w:trPr>
-          <w:cantSplit/>
-        </w:trPr>
-        <w:tc>
-          <w:tcPr>
-            <w:tcW w:w="1250" w:type="dxa"/>
-          </w:tcPr>
-          <w:p>
-            <w:pPr>
-              <w:spacing w:after="60"/>
-            </w:pPr>
-            <w:r>
-              <w:rPr>
-                <w:color w:val="666666"/>
-                <w:sz w:val="16"/>
-              </w:rPr>
-              <w:t xml:space="preserve">HOME-076</w:t>
+              <w:t xml:space="preserve">Vacuümdroger</w:t>
+            </w:r>
+          </w:p>
+        </w:tc>
+        <w:tc>
+          <w:tcPr>
+            <w:tcW w:w="5900" w:type="dxa"/>
+            <w:shd w:val="clear" w:color="auto" w:fill="FFFBEA"/>
+          </w:tcPr>
+          <w:p>
+            <w:pPr>
+              <w:spacing w:after="60"/>
+            </w:pPr>
+            <w:r>
+              <w:t xml:space="preserve"/>
+            </w:r>
+          </w:p>
+        </w:tc>
+      </w:tr>
+      <w:tr>
+        <w:trPr>
+          <w:cantSplit/>
+        </w:trPr>
+        <w:tc>
+          <w:tcPr>
+            <w:tcW w:w="1250" w:type="dxa"/>
+          </w:tcPr>
+          <w:p>
+            <w:pPr>
+              <w:spacing w:after="60"/>
+            </w:pPr>
+            <w:r>
+              <w:rPr>
+                <w:color w:val="666666"/>
+                <w:sz w:val="16"/>
+              </w:rPr>
+              <w:t xml:space="preserve">HOME-090</w:t>
             </w:r>
           </w:p>
         </w:tc>
@@ -5248,7 +6172,7 @@
                 <w:color w:val="666666"/>
                 <w:sz w:val="16"/>
               </w:rPr>
-              <w:t xml:space="preserve">HOME-077</w:t>
+              <w:t xml:space="preserve">HOME-091</w:t>
             </w:r>
           </w:p>
         </w:tc>
@@ -5314,7 +6238,7 @@
                 <w:color w:val="666666"/>
                 <w:sz w:val="16"/>
               </w:rPr>
-              <w:t xml:space="preserve">HOME-078</w:t>
+              <w:t xml:space="preserve">HOME-092</w:t>
             </w:r>
           </w:p>
         </w:tc>
@@ -5380,7 +6304,7 @@
                 <w:color w:val="666666"/>
                 <w:sz w:val="16"/>
               </w:rPr>
-              <w:t xml:space="preserve">HOME-079</w:t>
+              <w:t xml:space="preserve">HOME-093</w:t>
             </w:r>
           </w:p>
         </w:tc>
@@ -5446,7 +6370,7 @@
                 <w:color w:val="666666"/>
                 <w:sz w:val="16"/>
               </w:rPr>
-              <w:t xml:space="preserve">HOME-080</w:t>
+              <w:t xml:space="preserve">HOME-094</w:t>
             </w:r>
           </w:p>
         </w:tc>
@@ -5476,43 +6400,43 @@
               <w:spacing w:after="60"/>
             </w:pPr>
             <w:r>
-              <w:t xml:space="preserve">Coalescer olie-waterafscheider voor continue waterinloop.</w:t>
-            </w:r>
-          </w:p>
-        </w:tc>
-        <w:tc>
-          <w:tcPr>
-            <w:tcW w:w="5900" w:type="dxa"/>
-            <w:shd w:val="clear" w:color="auto" w:fill="FFFBEA"/>
-          </w:tcPr>
-          <w:p>
-            <w:pPr>
-              <w:spacing w:after="60"/>
-            </w:pPr>
-            <w:r>
-              <w:t xml:space="preserve"/>
-            </w:r>
-          </w:p>
-        </w:tc>
-      </w:tr>
-      <w:tr>
-        <w:trPr>
-          <w:cantSplit/>
-        </w:trPr>
-        <w:tc>
-          <w:tcPr>
-            <w:tcW w:w="1250" w:type="dxa"/>
-          </w:tcPr>
-          <w:p>
-            <w:pPr>
-              <w:spacing w:after="60"/>
-            </w:pPr>
-            <w:r>
-              <w:rPr>
-                <w:color w:val="666666"/>
-                <w:sz w:val="16"/>
-              </w:rPr>
-              <w:t xml:space="preserve">HOME-081</w:t>
+              <w:t xml:space="preserve">Coalescentie olie-waterafscheider voor continue waterinloop.</w:t>
+            </w:r>
+          </w:p>
+        </w:tc>
+        <w:tc>
+          <w:tcPr>
+            <w:tcW w:w="5900" w:type="dxa"/>
+            <w:shd w:val="clear" w:color="auto" w:fill="FFFBEA"/>
+          </w:tcPr>
+          <w:p>
+            <w:pPr>
+              <w:spacing w:after="60"/>
+            </w:pPr>
+            <w:r>
+              <w:t xml:space="preserve"/>
+            </w:r>
+          </w:p>
+        </w:tc>
+      </w:tr>
+      <w:tr>
+        <w:trPr>
+          <w:cantSplit/>
+        </w:trPr>
+        <w:tc>
+          <w:tcPr>
+            <w:tcW w:w="1250" w:type="dxa"/>
+          </w:tcPr>
+          <w:p>
+            <w:pPr>
+              <w:spacing w:after="60"/>
+            </w:pPr>
+            <w:r>
+              <w:rPr>
+                <w:color w:val="666666"/>
+                <w:sz w:val="16"/>
+              </w:rPr>
+              <w:t xml:space="preserve">HOME-095</w:t>
             </w:r>
           </w:p>
         </w:tc>
@@ -5578,7 +6502,7 @@
                 <w:color w:val="666666"/>
                 <w:sz w:val="16"/>
               </w:rPr>
-              <w:t xml:space="preserve">HOME-082</w:t>
+              <w:t xml:space="preserve">HOME-096</w:t>
             </w:r>
           </w:p>
         </w:tc>
@@ -5644,7 +6568,7 @@
                 <w:color w:val="666666"/>
                 <w:sz w:val="16"/>
               </w:rPr>
-              <w:t xml:space="preserve">HOME-083</w:t>
+              <w:t xml:space="preserve">HOME-097</w:t>
             </w:r>
           </w:p>
         </w:tc>
@@ -5710,7 +6634,7 @@
                 <w:color w:val="666666"/>
                 <w:sz w:val="16"/>
               </w:rPr>
-              <w:t xml:space="preserve">HOME-084</w:t>
+              <w:t xml:space="preserve">HOME-098</w:t>
             </w:r>
           </w:p>
         </w:tc>
@@ -5776,7 +6700,7 @@
                 <w:color w:val="666666"/>
                 <w:sz w:val="16"/>
               </w:rPr>
-              <w:t xml:space="preserve">HOME-085</w:t>
+              <w:t xml:space="preserve">HOME-099</w:t>
             </w:r>
           </w:p>
         </w:tc>
@@ -5842,7 +6766,7 @@
                 <w:color w:val="666666"/>
                 <w:sz w:val="16"/>
               </w:rPr>
-              <w:t xml:space="preserve">HOME-086</w:t>
+              <w:t xml:space="preserve">HOME-100</w:t>
             </w:r>
           </w:p>
         </w:tc>
@@ -5908,7 +6832,7 @@
                 <w:color w:val="666666"/>
                 <w:sz w:val="16"/>
               </w:rPr>
-              <w:t xml:space="preserve">HOME-087</w:t>
+              <w:t xml:space="preserve">HOME-101</w:t>
             </w:r>
           </w:p>
         </w:tc>
@@ -5974,7 +6898,7 @@
                 <w:color w:val="666666"/>
                 <w:sz w:val="16"/>
               </w:rPr>
-              <w:t xml:space="preserve">HOME-088</w:t>
+              <w:t xml:space="preserve">HOME-102</w:t>
             </w:r>
           </w:p>
         </w:tc>
@@ -6039,29 +6963,29 @@
                 <w:b/>
                 <w:color w:val="0E0B24"/>
               </w:rPr>
-              <w:t xml:space="preserve">Blok: Wat schone olie oplevert</w:t>
-            </w:r>
-          </w:p>
-        </w:tc>
-      </w:tr>
-      <w:tr>
-        <w:trPr>
-          <w:cantSplit/>
-        </w:trPr>
-        <w:tc>
-          <w:tcPr>
-            <w:tcW w:w="1250" w:type="dxa"/>
-          </w:tcPr>
-          <w:p>
-            <w:pPr>
-              <w:spacing w:after="60"/>
-            </w:pPr>
-            <w:r>
-              <w:rPr>
-                <w:color w:val="666666"/>
-                <w:sz w:val="16"/>
-              </w:rPr>
-              <w:t xml:space="preserve">HOME-089</w:t>
+              <w:t xml:space="preserve">Blok: Wat propere olie oplevert</w:t>
+            </w:r>
+          </w:p>
+        </w:tc>
+      </w:tr>
+      <w:tr>
+        <w:trPr>
+          <w:cantSplit/>
+        </w:trPr>
+        <w:tc>
+          <w:tcPr>
+            <w:tcW w:w="1250" w:type="dxa"/>
+          </w:tcPr>
+          <w:p>
+            <w:pPr>
+              <w:spacing w:after="60"/>
+            </w:pPr>
+            <w:r>
+              <w:rPr>
+                <w:color w:val="666666"/>
+                <w:sz w:val="16"/>
+              </w:rPr>
+              <w:t xml:space="preserve">HOME-103</w:t>
             </w:r>
           </w:p>
         </w:tc>
@@ -6091,43 +7015,43 @@
               <w:spacing w:after="60"/>
             </w:pPr>
             <w:r>
-              <w:t xml:space="preserve">Wat schone olie oplevert</w:t>
-            </w:r>
-          </w:p>
-        </w:tc>
-        <w:tc>
-          <w:tcPr>
-            <w:tcW w:w="5900" w:type="dxa"/>
-            <w:shd w:val="clear" w:color="auto" w:fill="FFFBEA"/>
-          </w:tcPr>
-          <w:p>
-            <w:pPr>
-              <w:spacing w:after="60"/>
-            </w:pPr>
-            <w:r>
-              <w:t xml:space="preserve"/>
-            </w:r>
-          </w:p>
-        </w:tc>
-      </w:tr>
-      <w:tr>
-        <w:trPr>
-          <w:cantSplit/>
-        </w:trPr>
-        <w:tc>
-          <w:tcPr>
-            <w:tcW w:w="1250" w:type="dxa"/>
-          </w:tcPr>
-          <w:p>
-            <w:pPr>
-              <w:spacing w:after="60"/>
-            </w:pPr>
-            <w:r>
-              <w:rPr>
-                <w:color w:val="666666"/>
-                <w:sz w:val="16"/>
-              </w:rPr>
-              <w:t xml:space="preserve">HOME-090</w:t>
+              <w:t xml:space="preserve">Wat propere olie oplevert</w:t>
+            </w:r>
+          </w:p>
+        </w:tc>
+        <w:tc>
+          <w:tcPr>
+            <w:tcW w:w="5900" w:type="dxa"/>
+            <w:shd w:val="clear" w:color="auto" w:fill="FFFBEA"/>
+          </w:tcPr>
+          <w:p>
+            <w:pPr>
+              <w:spacing w:after="60"/>
+            </w:pPr>
+            <w:r>
+              <w:t xml:space="preserve"/>
+            </w:r>
+          </w:p>
+        </w:tc>
+      </w:tr>
+      <w:tr>
+        <w:trPr>
+          <w:cantSplit/>
+        </w:trPr>
+        <w:tc>
+          <w:tcPr>
+            <w:tcW w:w="1250" w:type="dxa"/>
+          </w:tcPr>
+          <w:p>
+            <w:pPr>
+              <w:spacing w:after="60"/>
+            </w:pPr>
+            <w:r>
+              <w:rPr>
+                <w:color w:val="666666"/>
+                <w:sz w:val="16"/>
+              </w:rPr>
+              <w:t xml:space="preserve">HOME-104</w:t>
             </w:r>
           </w:p>
         </w:tc>
@@ -6193,7 +7117,7 @@
                 <w:color w:val="666666"/>
                 <w:sz w:val="16"/>
               </w:rPr>
-              <w:t xml:space="preserve">HOME-091</w:t>
+              <w:t xml:space="preserve">HOME-105</w:t>
             </w:r>
           </w:p>
         </w:tc>
@@ -6259,7 +7183,7 @@
                 <w:color w:val="666666"/>
                 <w:sz w:val="16"/>
               </w:rPr>
-              <w:t xml:space="preserve">HOME-092</w:t>
+              <w:t xml:space="preserve">HOME-106</w:t>
             </w:r>
           </w:p>
         </w:tc>
@@ -6325,7 +7249,7 @@
                 <w:color w:val="666666"/>
                 <w:sz w:val="16"/>
               </w:rPr>
-              <w:t xml:space="preserve">HOME-093</w:t>
+              <w:t xml:space="preserve">HOME-107</w:t>
             </w:r>
           </w:p>
         </w:tc>
@@ -6391,7 +7315,7 @@
                 <w:color w:val="666666"/>
                 <w:sz w:val="16"/>
               </w:rPr>
-              <w:t xml:space="preserve">HOME-094</w:t>
+              <w:t xml:space="preserve">HOME-108</w:t>
             </w:r>
           </w:p>
         </w:tc>
@@ -6457,7 +7381,7 @@
                 <w:color w:val="666666"/>
                 <w:sz w:val="16"/>
               </w:rPr>
-              <w:t xml:space="preserve">HOME-095</w:t>
+              <w:t xml:space="preserve">HOME-109</w:t>
             </w:r>
           </w:p>
         </w:tc>
@@ -6523,7 +7447,7 @@
                 <w:color w:val="666666"/>
                 <w:sz w:val="16"/>
               </w:rPr>
-              <w:t xml:space="preserve">HOME-096</w:t>
+              <w:t xml:space="preserve">HOME-110</w:t>
             </w:r>
           </w:p>
         </w:tc>
@@ -6589,7 +7513,7 @@
                 <w:color w:val="666666"/>
                 <w:sz w:val="16"/>
               </w:rPr>
-              <w:t xml:space="preserve">HOME-097</w:t>
+              <w:t xml:space="preserve">HOME-111</w:t>
             </w:r>
           </w:p>
         </w:tc>
@@ -6655,7 +7579,7 @@
                 <w:color w:val="666666"/>
                 <w:sz w:val="16"/>
               </w:rPr>
-              <w:t xml:space="preserve">HOME-098</w:t>
+              <w:t xml:space="preserve">HOME-112</w:t>
             </w:r>
           </w:p>
         </w:tc>
@@ -6721,7 +7645,7 @@
                 <w:color w:val="666666"/>
                 <w:sz w:val="16"/>
               </w:rPr>
-              <w:t xml:space="preserve">HOME-099</w:t>
+              <w:t xml:space="preserve">HOME-113</w:t>
             </w:r>
           </w:p>
         </w:tc>
@@ -6808,7 +7732,7 @@
                 <w:color w:val="666666"/>
                 <w:sz w:val="16"/>
               </w:rPr>
-              <w:t xml:space="preserve">HOME-100</w:t>
+              <w:t xml:space="preserve">HOME-114</w:t>
             </w:r>
           </w:p>
         </w:tc>
@@ -6874,7 +7798,7 @@
                 <w:color w:val="666666"/>
                 <w:sz w:val="16"/>
               </w:rPr>
-              <w:t xml:space="preserve">HOME-101</w:t>
+              <w:t xml:space="preserve">HOME-115</w:t>
             </w:r>
           </w:p>
         </w:tc>
@@ -6940,7 +7864,7 @@
                 <w:color w:val="666666"/>
                 <w:sz w:val="16"/>
               </w:rPr>
-              <w:t xml:space="preserve">HOME-102</w:t>
+              <w:t xml:space="preserve">HOME-116</w:t>
             </w:r>
           </w:p>
         </w:tc>
@@ -7006,7 +7930,7 @@
                 <w:color w:val="666666"/>
                 <w:sz w:val="16"/>
               </w:rPr>
-              <w:t xml:space="preserve">HOME-103</w:t>
+              <w:t xml:space="preserve">HOME-117</w:t>
             </w:r>
           </w:p>
         </w:tc>
@@ -7072,7 +7996,7 @@
                 <w:color w:val="666666"/>
                 <w:sz w:val="16"/>
               </w:rPr>
-              <w:t xml:space="preserve">HOME-104</w:t>
+              <w:t xml:space="preserve">HOME-118</w:t>
             </w:r>
           </w:p>
         </w:tc>
@@ -7138,7 +8062,7 @@
                 <w:color w:val="666666"/>
                 <w:sz w:val="16"/>
               </w:rPr>
-              <w:t xml:space="preserve">HOME-105</w:t>
+              <w:t xml:space="preserve">HOME-119</w:t>
             </w:r>
           </w:p>
         </w:tc>
@@ -7204,7 +8128,7 @@
                 <w:color w:val="666666"/>
                 <w:sz w:val="16"/>
               </w:rPr>
-              <w:t xml:space="preserve">HOME-106</w:t>
+              <w:t xml:space="preserve">HOME-120</w:t>
             </w:r>
           </w:p>
         </w:tc>
@@ -7270,7 +8194,7 @@
                 <w:color w:val="666666"/>
                 <w:sz w:val="16"/>
               </w:rPr>
-              <w:t xml:space="preserve">HOME-107</w:t>
+              <w:t xml:space="preserve">HOME-121</w:t>
             </w:r>
           </w:p>
         </w:tc>
@@ -7336,7 +8260,7 @@
                 <w:color w:val="666666"/>
                 <w:sz w:val="16"/>
               </w:rPr>
-              <w:t xml:space="preserve">HOME-108</w:t>
+              <w:t xml:space="preserve">HOME-122</w:t>
             </w:r>
           </w:p>
         </w:tc>
@@ -7423,7 +8347,7 @@
                 <w:color w:val="666666"/>
                 <w:sz w:val="16"/>
               </w:rPr>
-              <w:t xml:space="preserve">HOME-109</w:t>
+              <w:t xml:space="preserve">HOME-123</w:t>
             </w:r>
           </w:p>
         </w:tc>
@@ -7489,7 +8413,7 @@
                 <w:color w:val="666666"/>
                 <w:sz w:val="16"/>
               </w:rPr>
-              <w:t xml:space="preserve">HOME-110</w:t>
+              <w:t xml:space="preserve">HOME-124</w:t>
             </w:r>
           </w:p>
         </w:tc>
@@ -7555,7 +8479,7 @@
                 <w:color w:val="666666"/>
                 <w:sz w:val="16"/>
               </w:rPr>
-              <w:t xml:space="preserve">HOME-111</w:t>
+              <w:t xml:space="preserve">HOME-125</w:t>
             </w:r>
           </w:p>
         </w:tc>
@@ -7642,7 +8566,7 @@
                 <w:color w:val="666666"/>
                 <w:sz w:val="16"/>
               </w:rPr>
-              <w:t xml:space="preserve">HOME-112</w:t>
+              <w:t xml:space="preserve">HOME-126</w:t>
             </w:r>
           </w:p>
         </w:tc>
@@ -7708,7 +8632,7 @@
                 <w:color w:val="666666"/>
                 <w:sz w:val="16"/>
               </w:rPr>
-              <w:t xml:space="preserve">HOME-113</w:t>
+              <w:t xml:space="preserve">HOME-127</w:t>
             </w:r>
           </w:p>
         </w:tc>
@@ -7774,7 +8698,7 @@
                 <w:color w:val="666666"/>
                 <w:sz w:val="16"/>
               </w:rPr>
-              <w:t xml:space="preserve">HOME-114</w:t>
+              <w:t xml:space="preserve">HOME-128</w:t>
             </w:r>
           </w:p>
         </w:tc>
@@ -7840,7 +8764,7 @@
                 <w:color w:val="666666"/>
                 <w:sz w:val="16"/>
               </w:rPr>
-              <w:t xml:space="preserve">HOME-115</w:t>
+              <w:t xml:space="preserve">HOME-129</w:t>
             </w:r>
           </w:p>
         </w:tc>
@@ -7906,7 +8830,7 @@
                 <w:color w:val="666666"/>
                 <w:sz w:val="16"/>
               </w:rPr>
-              <w:t xml:space="preserve">HOME-116</w:t>
+              <w:t xml:space="preserve">HOME-130</w:t>
             </w:r>
           </w:p>
         </w:tc>
@@ -7972,7 +8896,7 @@
                 <w:color w:val="666666"/>
                 <w:sz w:val="16"/>
               </w:rPr>
-              <w:t xml:space="preserve">HOME-117</w:t>
+              <w:t xml:space="preserve">HOME-131</w:t>
             </w:r>
           </w:p>
         </w:tc>
@@ -8038,7 +8962,7 @@
                 <w:color w:val="666666"/>
                 <w:sz w:val="16"/>
               </w:rPr>
-              <w:t xml:space="preserve">HOME-118</w:t>
+              <w:t xml:space="preserve">HOME-132</w:t>
             </w:r>
           </w:p>
         </w:tc>
@@ -8068,43 +8992,43 @@
               <w:spacing w:after="60"/>
             </w:pPr>
             <w:r>
-              <w:t xml:space="preserve">Sales Manager</w:t>
-            </w:r>
-          </w:p>
-        </w:tc>
-        <w:tc>
-          <w:tcPr>
-            <w:tcW w:w="5900" w:type="dxa"/>
-            <w:shd w:val="clear" w:color="auto" w:fill="FFFBEA"/>
-          </w:tcPr>
-          <w:p>
-            <w:pPr>
-              <w:spacing w:after="60"/>
-            </w:pPr>
-            <w:r>
-              <w:t xml:space="preserve"/>
-            </w:r>
-          </w:p>
-        </w:tc>
-      </w:tr>
-      <w:tr>
-        <w:trPr>
-          <w:cantSplit/>
-        </w:trPr>
-        <w:tc>
-          <w:tcPr>
-            <w:tcW w:w="1250" w:type="dxa"/>
-          </w:tcPr>
-          <w:p>
-            <w:pPr>
-              <w:spacing w:after="60"/>
-            </w:pPr>
-            <w:r>
-              <w:rPr>
-                <w:color w:val="666666"/>
-                <w:sz w:val="16"/>
-              </w:rPr>
-              <w:t xml:space="preserve">HOME-119</w:t>
+              <w:t xml:space="preserve">Managing Director</w:t>
+            </w:r>
+          </w:p>
+        </w:tc>
+        <w:tc>
+          <w:tcPr>
+            <w:tcW w:w="5900" w:type="dxa"/>
+            <w:shd w:val="clear" w:color="auto" w:fill="FFFBEA"/>
+          </w:tcPr>
+          <w:p>
+            <w:pPr>
+              <w:spacing w:after="60"/>
+            </w:pPr>
+            <w:r>
+              <w:t xml:space="preserve"/>
+            </w:r>
+          </w:p>
+        </w:tc>
+      </w:tr>
+      <w:tr>
+        <w:trPr>
+          <w:cantSplit/>
+        </w:trPr>
+        <w:tc>
+          <w:tcPr>
+            <w:tcW w:w="1250" w:type="dxa"/>
+          </w:tcPr>
+          <w:p>
+            <w:pPr>
+              <w:spacing w:after="60"/>
+            </w:pPr>
+            <w:r>
+              <w:rPr>
+                <w:color w:val="666666"/>
+                <w:sz w:val="16"/>
+              </w:rPr>
+              <w:t xml:space="preserve">HOME-133</w:t>
             </w:r>
           </w:p>
         </w:tc>
@@ -8170,7 +9094,7 @@
                 <w:color w:val="666666"/>
                 <w:sz w:val="16"/>
               </w:rPr>
-              <w:t xml:space="preserve">HOME-120</w:t>
+              <w:t xml:space="preserve">HOME-134</w:t>
             </w:r>
           </w:p>
         </w:tc>
@@ -8236,7 +9160,7 @@
                 <w:color w:val="666666"/>
                 <w:sz w:val="16"/>
               </w:rPr>
-              <w:t xml:space="preserve">HOME-121</w:t>
+              <w:t xml:space="preserve">HOME-135</w:t>
             </w:r>
           </w:p>
         </w:tc>
@@ -9151,7 +10075,7 @@
               <w:spacing w:after="60"/>
             </w:pPr>
             <w:r>
-              <w:t xml:space="preserve">De meeste schadelijke deeltjes zijn kleiner dan 5 µm: onzichtbaar, en kleiner dan de spleten in pompen en servokleppen.</w:t>
+              <w:t xml:space="preserve">De meeste schadelijke deeltjes zijn kleiner dan 5 µm: onzichtbaar, en kleiner dan de spleten in pompen en servoventielen.</w:t>
             </w:r>
           </w:p>
         </w:tc>
@@ -10690,7 +11614,7 @@
               <w:spacing w:after="60"/>
             </w:pPr>
             <w:r>
-              <w:t xml:space="preserve">Oxidatieresten zetten zich af op kleppen; servo- en proportionele kleppen gaan haperen.</w:t>
+              <w:t xml:space="preserve">Oxidatieresten zetten zich af op kleppen; servo- en proportionele ventielen gaan haperen.</w:t>
             </w:r>
           </w:p>
         </w:tc>
@@ -13393,7 +14317,7 @@
               <w:spacing w:after="60"/>
             </w:pPr>
             <w:r>
-              <w:t xml:space="preserve">Sales Manager</w:t>
+              <w:t xml:space="preserve">Managing Director</w:t>
             </w:r>
           </w:p>
         </w:tc>
@@ -14191,7 +15115,7 @@
               <w:spacing w:after="60"/>
             </w:pPr>
             <w:r>
-              <w:t xml:space="preserve">Kies uit 46 Triple R-systemen en 27 filterelementen en voorfilters: van een compacte bypassfilter op de drukleiding tot mobiele reinigers, ontwateraars en centrifuges. Filter op categorie, olievolume en vloeistof, bekijk de specificaties per model en voeg ze toe aan uw offerteaanvraag.</w:t>
+              <w:t xml:space="preserve">Kies uit 46 Triple R-systemen en 27 filterelementen en voorfilters: van een compacte bypassfilter op de drukleiding tot mobiele reinigers, vacuümdrogers en centrifuges. Filter op categorie, olievolume en vloeistof, bekijk de specificaties per model en voeg ze toe aan uw offerteaanvraag.</w:t>
             </w:r>
           </w:p>
         </w:tc>
@@ -17356,7 +18280,7 @@
               <w:spacing w:after="60"/>
             </w:pPr>
             <w:r>
-              <w:t xml:space="preserve">Testrapport vacuümontwateraar</w:t>
+              <w:t xml:space="preserve">Testrapport vacuümdroger</w:t>
             </w:r>
           </w:p>
         </w:tc>
@@ -17839,7 +18763,7 @@
               <w:spacing w:after="60"/>
             </w:pPr>
             <w:r>
-              <w:t xml:space="preserve">Sales Manager</w:t>
+              <w:t xml:space="preserve">Managing Director</w:t>
             </w:r>
           </w:p>
         </w:tc>
@@ -21361,7 +22285,7 @@
               <w:spacing w:after="60"/>
             </w:pPr>
             <w:r>
-              <w:t xml:space="preserve">Sales Manager</w:t>
+              <w:t xml:space="preserve">Managing Director</w:t>
             </w:r>
           </w:p>
         </w:tc>
@@ -22159,7 +23083,7 @@
               <w:spacing w:after="60"/>
             </w:pPr>
             <w:r>
-              <w:t xml:space="preserve">Onderhoudstechnicus bij een grote turbineas in een industriële hal</w:t>
+              <w:t xml:space="preserve">Onderhoudstechnicus bij een grote turbines in een industriële hal</w:t>
             </w:r>
           </w:p>
         </w:tc>
@@ -24973,7 +25897,7 @@
               <w:spacing w:after="60"/>
             </w:pPr>
             <w:r>
-              <w:t xml:space="preserve">Tandwielolie langdurig schoon gehouden.</w:t>
+              <w:t xml:space="preserve">Tandwielolie langdurig proper gehouden.</w:t>
             </w:r>
           </w:p>
         </w:tc>
@@ -25588,7 +26512,7 @@
               <w:spacing w:after="60"/>
             </w:pPr>
             <w:r>
-              <w:t xml:space="preserve">Sales Manager</w:t>
+              <w:t xml:space="preserve">Managing Director</w:t>
             </w:r>
           </w:p>
         </w:tc>
@@ -36391,7 +37315,7 @@
               <w:spacing w:after="60"/>
             </w:pPr>
             <w:r>
-              <w:t xml:space="preserve">Sales Manager</w:t>
+              <w:t xml:space="preserve">Managing Director</w:t>
             </w:r>
           </w:p>
         </w:tc>
@@ -36838,7 +37762,7 @@
               <w:spacing w:after="60"/>
             </w:pPr>
             <w:r>
-              <w:t xml:space="preserve">Huur een Triple R-oliereiniger of vacuümontwateraar voor flushing, inbedrijfstelling of een proefperiode. Kies een toestel of vraag een specifiek toestel aan.</w:t>
+              <w:t xml:space="preserve">Huur een Triple R-oliereiniger of vacuümdroger voor flushing, inbedrijfstelling of een proefperiode. Kies een toestel of vraag een specifiek toestel aan.</w:t>
             </w:r>
           </w:p>
         </w:tc>
@@ -38464,7 +39388,7 @@
               <w:spacing w:after="60"/>
             </w:pPr>
             <w:r>
-              <w:t xml:space="preserve">Vacuümontwateraar</w:t>
+              <w:t xml:space="preserve">Vacuümdroger</w:t>
             </w:r>
           </w:p>
         </w:tc>
@@ -38530,7 +39454,7 @@
               <w:spacing w:after="60"/>
             </w:pPr>
             <w:r>
-              <w:t xml:space="preserve">Vacuümontwateraar</w:t>
+              <w:t xml:space="preserve">Vacuümdroger</w:t>
             </w:r>
           </w:p>
         </w:tc>
@@ -40111,7 +41035,7 @@
               <w:spacing w:after="60"/>
             </w:pPr>
             <w:r>
-              <w:t xml:space="preserve">Sales Manager</w:t>
+              <w:t xml:space="preserve">Managing Director</w:t>
             </w:r>
           </w:p>
         </w:tc>
@@ -41841,6 +42765,204 @@
                 <w:color w:val="444444"/>
                 <w:sz w:val="18"/>
               </w:rPr>
+              <w:t xml:space="preserve">Voorbeeldtekst in veld</w:t>
+            </w:r>
+          </w:p>
+        </w:tc>
+        <w:tc>
+          <w:tcPr>
+            <w:tcW w:w="5900" w:type="dxa"/>
+          </w:tcPr>
+          <w:p>
+            <w:pPr>
+              <w:spacing w:after="60"/>
+            </w:pPr>
+            <w:r>
+              <w:t xml:space="preserve">Zoek op product of artikelnummer</w:t>
+            </w:r>
+          </w:p>
+        </w:tc>
+        <w:tc>
+          <w:tcPr>
+            <w:tcW w:w="5900" w:type="dxa"/>
+            <w:shd w:val="clear" w:color="auto" w:fill="FFFBEA"/>
+          </w:tcPr>
+          <w:p>
+            <w:pPr>
+              <w:spacing w:after="60"/>
+            </w:pPr>
+            <w:r>
+              <w:t xml:space="preserve"/>
+            </w:r>
+          </w:p>
+        </w:tc>
+      </w:tr>
+      <w:tr>
+        <w:trPr>
+          <w:cantSplit/>
+        </w:trPr>
+        <w:tc>
+          <w:tcPr>
+            <w:tcW w:w="1250" w:type="dxa"/>
+          </w:tcPr>
+          <w:p>
+            <w:pPr>
+              <w:spacing w:after="60"/>
+            </w:pPr>
+            <w:r>
+              <w:rPr>
+                <w:color w:val="666666"/>
+                <w:sz w:val="16"/>
+              </w:rPr>
+              <w:t xml:space="preserve">OFF-022</w:t>
+            </w:r>
+          </w:p>
+        </w:tc>
+        <w:tc>
+          <w:tcPr>
+            <w:tcW w:w="1800" w:type="dxa"/>
+          </w:tcPr>
+          <w:p>
+            <w:pPr>
+              <w:spacing w:after="60"/>
+            </w:pPr>
+            <w:r>
+              <w:rPr>
+                <w:color w:val="444444"/>
+                <w:sz w:val="18"/>
+              </w:rPr>
+              <w:t xml:space="preserve">Tekst</w:t>
+            </w:r>
+          </w:p>
+        </w:tc>
+        <w:tc>
+          <w:tcPr>
+            <w:tcW w:w="5900" w:type="dxa"/>
+          </w:tcPr>
+          <w:p>
+            <w:pPr>
+              <w:spacing w:after="60"/>
+            </w:pPr>
+            <w:r>
+              <w:t xml:space="preserve">Vaak mee besteld:</w:t>
+            </w:r>
+          </w:p>
+        </w:tc>
+        <w:tc>
+          <w:tcPr>
+            <w:tcW w:w="5900" w:type="dxa"/>
+            <w:shd w:val="clear" w:color="auto" w:fill="FFFBEA"/>
+          </w:tcPr>
+          <w:p>
+            <w:pPr>
+              <w:spacing w:after="60"/>
+            </w:pPr>
+            <w:r>
+              <w:t xml:space="preserve"/>
+            </w:r>
+          </w:p>
+        </w:tc>
+      </w:tr>
+      <w:tr>
+        <w:trPr>
+          <w:cantSplit/>
+        </w:trPr>
+        <w:tc>
+          <w:tcPr>
+            <w:tcW w:w="1250" w:type="dxa"/>
+          </w:tcPr>
+          <w:p>
+            <w:pPr>
+              <w:spacing w:after="60"/>
+            </w:pPr>
+            <w:r>
+              <w:rPr>
+                <w:color w:val="666666"/>
+                <w:sz w:val="16"/>
+              </w:rPr>
+              <w:t xml:space="preserve">OFF-023</w:t>
+            </w:r>
+          </w:p>
+        </w:tc>
+        <w:tc>
+          <w:tcPr>
+            <w:tcW w:w="1800" w:type="dxa"/>
+          </w:tcPr>
+          <w:p>
+            <w:pPr>
+              <w:spacing w:after="60"/>
+            </w:pPr>
+            <w:r>
+              <w:rPr>
+                <w:color w:val="444444"/>
+                <w:sz w:val="18"/>
+              </w:rPr>
+              <w:t xml:space="preserve">Link</w:t>
+            </w:r>
+          </w:p>
+        </w:tc>
+        <w:tc>
+          <w:tcPr>
+            <w:tcW w:w="5900" w:type="dxa"/>
+          </w:tcPr>
+          <w:p>
+            <w:pPr>
+              <w:spacing w:after="60"/>
+            </w:pPr>
+            <w:r>
+              <w:t xml:space="preserve">Bekijk alle producten</w:t>
+            </w:r>
+          </w:p>
+        </w:tc>
+        <w:tc>
+          <w:tcPr>
+            <w:tcW w:w="5900" w:type="dxa"/>
+            <w:shd w:val="clear" w:color="auto" w:fill="FFFBEA"/>
+          </w:tcPr>
+          <w:p>
+            <w:pPr>
+              <w:spacing w:after="60"/>
+            </w:pPr>
+            <w:r>
+              <w:t xml:space="preserve"/>
+            </w:r>
+          </w:p>
+        </w:tc>
+      </w:tr>
+      <w:tr>
+        <w:trPr>
+          <w:cantSplit/>
+        </w:trPr>
+        <w:tc>
+          <w:tcPr>
+            <w:tcW w:w="1250" w:type="dxa"/>
+          </w:tcPr>
+          <w:p>
+            <w:pPr>
+              <w:spacing w:after="60"/>
+            </w:pPr>
+            <w:r>
+              <w:rPr>
+                <w:color w:val="666666"/>
+                <w:sz w:val="16"/>
+              </w:rPr>
+              <w:t xml:space="preserve">OFF-024</w:t>
+            </w:r>
+          </w:p>
+        </w:tc>
+        <w:tc>
+          <w:tcPr>
+            <w:tcW w:w="1800" w:type="dxa"/>
+          </w:tcPr>
+          <w:p>
+            <w:pPr>
+              <w:spacing w:after="60"/>
+            </w:pPr>
+            <w:r>
+              <w:rPr>
+                <w:color w:val="444444"/>
+                <w:sz w:val="18"/>
+              </w:rPr>
               <w:t xml:space="preserve">Titel</w:t>
             </w:r>
           </w:p>
@@ -41890,7 +43012,7 @@
                 <w:color w:val="666666"/>
                 <w:sz w:val="16"/>
               </w:rPr>
-              <w:t xml:space="preserve">OFF-022</w:t>
+              <w:t xml:space="preserve">OFF-025</w:t>
             </w:r>
           </w:p>
         </w:tc>
@@ -41956,7 +43078,7 @@
                 <w:color w:val="666666"/>
                 <w:sz w:val="16"/>
               </w:rPr>
-              <w:t xml:space="preserve">OFF-023</w:t>
+              <w:t xml:space="preserve">OFF-026</w:t>
             </w:r>
           </w:p>
         </w:tc>
@@ -42022,7 +43144,7 @@
                 <w:color w:val="666666"/>
                 <w:sz w:val="16"/>
               </w:rPr>
-              <w:t xml:space="preserve">OFF-024</w:t>
+              <w:t xml:space="preserve">OFF-027</w:t>
             </w:r>
           </w:p>
         </w:tc>
@@ -42088,7 +43210,7 @@
                 <w:color w:val="666666"/>
                 <w:sz w:val="16"/>
               </w:rPr>
-              <w:t xml:space="preserve">OFF-025</w:t>
+              <w:t xml:space="preserve">OFF-028</w:t>
             </w:r>
           </w:p>
         </w:tc>
@@ -42154,7 +43276,7 @@
                 <w:color w:val="666666"/>
                 <w:sz w:val="16"/>
               </w:rPr>
-              <w:t xml:space="preserve">OFF-026</w:t>
+              <w:t xml:space="preserve">OFF-029</w:t>
             </w:r>
           </w:p>
         </w:tc>
@@ -42220,7 +43342,7 @@
                 <w:color w:val="666666"/>
                 <w:sz w:val="16"/>
               </w:rPr>
-              <w:t xml:space="preserve">OFF-027</w:t>
+              <w:t xml:space="preserve">OFF-030</w:t>
             </w:r>
           </w:p>
         </w:tc>
@@ -42286,7 +43408,7 @@
                 <w:color w:val="666666"/>
                 <w:sz w:val="16"/>
               </w:rPr>
-              <w:t xml:space="preserve">OFF-028</w:t>
+              <w:t xml:space="preserve">OFF-031</w:t>
             </w:r>
           </w:p>
         </w:tc>
@@ -42352,7 +43474,7 @@
                 <w:color w:val="666666"/>
                 <w:sz w:val="16"/>
               </w:rPr>
-              <w:t xml:space="preserve">OFF-029</w:t>
+              <w:t xml:space="preserve">OFF-032</w:t>
             </w:r>
           </w:p>
         </w:tc>
@@ -42418,7 +43540,7 @@
                 <w:color w:val="666666"/>
                 <w:sz w:val="16"/>
               </w:rPr>
-              <w:t xml:space="preserve">OFF-030</w:t>
+              <w:t xml:space="preserve">OFF-033</w:t>
             </w:r>
           </w:p>
         </w:tc>
@@ -42484,7 +43606,7 @@
                 <w:color w:val="666666"/>
                 <w:sz w:val="16"/>
               </w:rPr>
-              <w:t xml:space="preserve">OFF-031</w:t>
+              <w:t xml:space="preserve">OFF-034</w:t>
             </w:r>
           </w:p>
         </w:tc>
@@ -42550,7 +43672,7 @@
                 <w:color w:val="666666"/>
                 <w:sz w:val="16"/>
               </w:rPr>
-              <w:t xml:space="preserve">OFF-032</w:t>
+              <w:t xml:space="preserve">OFF-035</w:t>
             </w:r>
           </w:p>
         </w:tc>
@@ -42616,7 +43738,7 @@
                 <w:color w:val="666666"/>
                 <w:sz w:val="16"/>
               </w:rPr>
-              <w:t xml:space="preserve">OFF-033</w:t>
+              <w:t xml:space="preserve">OFF-036</w:t>
             </w:r>
           </w:p>
         </w:tc>
@@ -42682,7 +43804,7 @@
                 <w:color w:val="666666"/>
                 <w:sz w:val="16"/>
               </w:rPr>
-              <w:t xml:space="preserve">OFF-034</w:t>
+              <w:t xml:space="preserve">OFF-037</w:t>
             </w:r>
           </w:p>
         </w:tc>
@@ -42748,7 +43870,7 @@
                 <w:color w:val="666666"/>
                 <w:sz w:val="16"/>
               </w:rPr>
-              <w:t xml:space="preserve">OFF-035</w:t>
+              <w:t xml:space="preserve">OFF-038</w:t>
             </w:r>
           </w:p>
         </w:tc>
@@ -42814,7 +43936,7 @@
                 <w:color w:val="666666"/>
                 <w:sz w:val="16"/>
               </w:rPr>
-              <w:t xml:space="preserve">OFF-036</w:t>
+              <w:t xml:space="preserve">OFF-039</w:t>
             </w:r>
           </w:p>
         </w:tc>
@@ -42880,7 +44002,7 @@
                 <w:color w:val="666666"/>
                 <w:sz w:val="16"/>
               </w:rPr>
-              <w:t xml:space="preserve">OFF-037</w:t>
+              <w:t xml:space="preserve">OFF-040</w:t>
             </w:r>
           </w:p>
         </w:tc>
@@ -42946,7 +44068,7 @@
                 <w:color w:val="666666"/>
                 <w:sz w:val="16"/>
               </w:rPr>
-              <w:t xml:space="preserve">OFF-038</w:t>
+              <w:t xml:space="preserve">OFF-041</w:t>
             </w:r>
           </w:p>
         </w:tc>
@@ -43012,7 +44134,7 @@
                 <w:color w:val="666666"/>
                 <w:sz w:val="16"/>
               </w:rPr>
-              <w:t xml:space="preserve">OFF-039</w:t>
+              <w:t xml:space="preserve">OFF-042</w:t>
             </w:r>
           </w:p>
         </w:tc>
@@ -43078,7 +44200,7 @@
                 <w:color w:val="666666"/>
                 <w:sz w:val="16"/>
               </w:rPr>
-              <w:t xml:space="preserve">OFF-040</w:t>
+              <w:t xml:space="preserve">OFF-043</w:t>
             </w:r>
           </w:p>
         </w:tc>
@@ -43144,7 +44266,7 @@
                 <w:color w:val="666666"/>
                 <w:sz w:val="16"/>
               </w:rPr>
-              <w:t xml:space="preserve">OFF-041</w:t>
+              <w:t xml:space="preserve">OFF-044</w:t>
             </w:r>
           </w:p>
         </w:tc>
@@ -43210,7 +44332,7 @@
                 <w:color w:val="666666"/>
                 <w:sz w:val="16"/>
               </w:rPr>
-              <w:t xml:space="preserve">OFF-042</w:t>
+              <w:t xml:space="preserve">OFF-045</w:t>
             </w:r>
           </w:p>
         </w:tc>
@@ -43276,7 +44398,7 @@
                 <w:color w:val="666666"/>
                 <w:sz w:val="16"/>
               </w:rPr>
-              <w:t xml:space="preserve">OFF-043</w:t>
+              <w:t xml:space="preserve">OFF-046</w:t>
             </w:r>
           </w:p>
         </w:tc>
@@ -47602,7 +48724,7 @@
               <w:spacing w:after="60"/>
             </w:pPr>
             <w:r>
-              <w:t xml:space="preserve">Het filterelement absorbeert vrij en geëmulgeerd water. Bij veel water verwijdert de vacuümontwateraar 80% van het opgeloste en 100% van het vrije water.</w:t>
+              <w:t xml:space="preserve">Het filterelement absorbeert vrij en geëmulgeerd water. Bij veel water verwijdert de vacuümdroger 80% van het opgeloste en 100% van het vrije water.</w:t>
             </w:r>
           </w:p>
         </w:tc>
@@ -49843,7 +50965,7 @@
               <w:spacing w:after="60"/>
             </w:pPr>
             <w:r>
-              <w:t xml:space="preserve">Sales Manager</w:t>
+              <w:t xml:space="preserve">Managing Director</w:t>
             </w:r>
           </w:p>
         </w:tc>
@@ -50575,7 +51697,7 @@
               <w:spacing w:after="60"/>
             </w:pPr>
             <w:r>
-              <w:t xml:space="preserve">schone olie</w:t>
+              <w:t xml:space="preserve">propere olie</w:t>
             </w:r>
           </w:p>
         </w:tc>
@@ -57949,7 +59071,7 @@
               <w:spacing w:after="60"/>
             </w:pPr>
             <w:r>
-              <w:t xml:space="preserve">Vacuümontwateraar</w:t>
+              <w:t xml:space="preserve">Vacuümdroger</w:t>
             </w:r>
           </w:p>
         </w:tc>

</xml_diff>

<commit_message>
Referentienaam: Apiroc → Epiroc
Co-Authored-By: Claude Opus 5.5 <noreply@anthropic.com>
</commit_message>
<xml_diff>
--- a/design/copy/Triple-R-websiteteksten.docx
+++ b/design/copy/Triple-R-websiteteksten.docx
@@ -2068,7 +2068,7 @@
               <w:spacing w:after="60"/>
             </w:pPr>
             <w:r>
-              <w:t xml:space="preserve">Apiroc</w:t>
+              <w:t xml:space="preserve">Epiroc</w:t>
             </w:r>
           </w:p>
         </w:tc>
@@ -2992,7 +2992,7 @@
               <w:spacing w:after="60"/>
             </w:pPr>
             <w:r>
-              <w:t xml:space="preserve">Apiroc</w:t>
+              <w:t xml:space="preserve">Epiroc</w:t>
             </w:r>
           </w:p>
         </w:tc>
@@ -42765,20 +42765,20 @@
                 <w:color w:val="444444"/>
                 <w:sz w:val="18"/>
               </w:rPr>
-              <w:t xml:space="preserve">Voorbeeldtekst in veld</w:t>
-            </w:r>
-          </w:p>
-        </w:tc>
-        <w:tc>
-          <w:tcPr>
-            <w:tcW w:w="5900" w:type="dxa"/>
-          </w:tcPr>
-          <w:p>
-            <w:pPr>
-              <w:spacing w:after="60"/>
-            </w:pPr>
-            <w:r>
-              <w:t xml:space="preserve">Zoek op product of artikelnummer</w:t>
+              <w:t xml:space="preserve">Link</w:t>
+            </w:r>
+          </w:p>
+        </w:tc>
+        <w:tc>
+          <w:tcPr>
+            <w:tcW w:w="5900" w:type="dxa"/>
+          </w:tcPr>
+          <w:p>
+            <w:pPr>
+              <w:spacing w:after="60"/>
+            </w:pPr>
+            <w:r>
+              <w:t xml:space="preserve">Naar de producten</w:t>
             </w:r>
           </w:p>
         </w:tc>
@@ -42831,6 +42831,204 @@
                 <w:color w:val="444444"/>
                 <w:sz w:val="18"/>
               </w:rPr>
+              <w:t xml:space="preserve">Link</w:t>
+            </w:r>
+          </w:p>
+        </w:tc>
+        <w:tc>
+          <w:tcPr>
+            <w:tcW w:w="5900" w:type="dxa"/>
+          </w:tcPr>
+          <w:p>
+            <w:pPr>
+              <w:spacing w:after="60"/>
+            </w:pPr>
+            <w:r>
+              <w:t xml:space="preserve">Naar de huurtoestellen</w:t>
+            </w:r>
+          </w:p>
+        </w:tc>
+        <w:tc>
+          <w:tcPr>
+            <w:tcW w:w="5900" w:type="dxa"/>
+            <w:shd w:val="clear" w:color="auto" w:fill="FFFBEA"/>
+          </w:tcPr>
+          <w:p>
+            <w:pPr>
+              <w:spacing w:after="60"/>
+            </w:pPr>
+            <w:r>
+              <w:t xml:space="preserve"/>
+            </w:r>
+          </w:p>
+        </w:tc>
+      </w:tr>
+      <w:tr>
+        <w:trPr>
+          <w:cantSplit/>
+        </w:trPr>
+        <w:tc>
+          <w:tcPr>
+            <w:tcW w:w="1250" w:type="dxa"/>
+          </w:tcPr>
+          <w:p>
+            <w:pPr>
+              <w:spacing w:after="60"/>
+            </w:pPr>
+            <w:r>
+              <w:rPr>
+                <w:color w:val="666666"/>
+                <w:sz w:val="16"/>
+              </w:rPr>
+              <w:t xml:space="preserve">OFF-023</w:t>
+            </w:r>
+          </w:p>
+        </w:tc>
+        <w:tc>
+          <w:tcPr>
+            <w:tcW w:w="1800" w:type="dxa"/>
+          </w:tcPr>
+          <w:p>
+            <w:pPr>
+              <w:spacing w:after="60"/>
+            </w:pPr>
+            <w:r>
+              <w:rPr>
+                <w:color w:val="444444"/>
+                <w:sz w:val="18"/>
+              </w:rPr>
+              <w:t xml:space="preserve">Titel</w:t>
+            </w:r>
+          </w:p>
+        </w:tc>
+        <w:tc>
+          <w:tcPr>
+            <w:tcW w:w="5900" w:type="dxa"/>
+          </w:tcPr>
+          <w:p>
+            <w:pPr>
+              <w:spacing w:after="60"/>
+            </w:pPr>
+            <w:r>
+              <w:t xml:space="preserve">Uw gegevens</w:t>
+            </w:r>
+          </w:p>
+        </w:tc>
+        <w:tc>
+          <w:tcPr>
+            <w:tcW w:w="5900" w:type="dxa"/>
+            <w:shd w:val="clear" w:color="auto" w:fill="FFFBEA"/>
+          </w:tcPr>
+          <w:p>
+            <w:pPr>
+              <w:spacing w:after="60"/>
+            </w:pPr>
+            <w:r>
+              <w:t xml:space="preserve"/>
+            </w:r>
+          </w:p>
+        </w:tc>
+      </w:tr>
+      <w:tr>
+        <w:trPr>
+          <w:cantSplit/>
+        </w:trPr>
+        <w:tc>
+          <w:tcPr>
+            <w:tcW w:w="1250" w:type="dxa"/>
+          </w:tcPr>
+          <w:p>
+            <w:pPr>
+              <w:spacing w:after="60"/>
+            </w:pPr>
+            <w:r>
+              <w:rPr>
+                <w:color w:val="666666"/>
+                <w:sz w:val="16"/>
+              </w:rPr>
+              <w:t xml:space="preserve">OFF-024</w:t>
+            </w:r>
+          </w:p>
+        </w:tc>
+        <w:tc>
+          <w:tcPr>
+            <w:tcW w:w="1800" w:type="dxa"/>
+          </w:tcPr>
+          <w:p>
+            <w:pPr>
+              <w:spacing w:after="60"/>
+            </w:pPr>
+            <w:r>
+              <w:rPr>
+                <w:color w:val="444444"/>
+                <w:sz w:val="18"/>
+              </w:rPr>
+              <w:t xml:space="preserve">Veldlabel</w:t>
+            </w:r>
+          </w:p>
+        </w:tc>
+        <w:tc>
+          <w:tcPr>
+            <w:tcW w:w="5900" w:type="dxa"/>
+          </w:tcPr>
+          <w:p>
+            <w:pPr>
+              <w:spacing w:after="60"/>
+            </w:pPr>
+            <w:r>
+              <w:t xml:space="preserve">Naam</w:t>
+            </w:r>
+          </w:p>
+        </w:tc>
+        <w:tc>
+          <w:tcPr>
+            <w:tcW w:w="5900" w:type="dxa"/>
+            <w:shd w:val="clear" w:color="auto" w:fill="FFFBEA"/>
+          </w:tcPr>
+          <w:p>
+            <w:pPr>
+              <w:spacing w:after="60"/>
+            </w:pPr>
+            <w:r>
+              <w:t xml:space="preserve"/>
+            </w:r>
+          </w:p>
+        </w:tc>
+      </w:tr>
+      <w:tr>
+        <w:trPr>
+          <w:cantSplit/>
+        </w:trPr>
+        <w:tc>
+          <w:tcPr>
+            <w:tcW w:w="1250" w:type="dxa"/>
+          </w:tcPr>
+          <w:p>
+            <w:pPr>
+              <w:spacing w:after="60"/>
+            </w:pPr>
+            <w:r>
+              <w:rPr>
+                <w:color w:val="666666"/>
+                <w:sz w:val="16"/>
+              </w:rPr>
+              <w:t xml:space="preserve">OFF-025</w:t>
+            </w:r>
+          </w:p>
+        </w:tc>
+        <w:tc>
+          <w:tcPr>
+            <w:tcW w:w="1800" w:type="dxa"/>
+          </w:tcPr>
+          <w:p>
+            <w:pPr>
+              <w:spacing w:after="60"/>
+            </w:pPr>
+            <w:r>
+              <w:rPr>
+                <w:color w:val="444444"/>
+                <w:sz w:val="18"/>
+              </w:rPr>
               <w:t xml:space="preserve">Tekst</w:t>
             </w:r>
           </w:p>
@@ -42844,43 +43042,1099 @@
               <w:spacing w:after="60"/>
             </w:pPr>
             <w:r>
-              <w:t xml:space="preserve">Vaak mee besteld:</w:t>
-            </w:r>
-          </w:p>
-        </w:tc>
-        <w:tc>
-          <w:tcPr>
-            <w:tcW w:w="5900" w:type="dxa"/>
-            <w:shd w:val="clear" w:color="auto" w:fill="FFFBEA"/>
-          </w:tcPr>
-          <w:p>
-            <w:pPr>
-              <w:spacing w:after="60"/>
-            </w:pPr>
-            <w:r>
-              <w:t xml:space="preserve"/>
-            </w:r>
-          </w:p>
-        </w:tc>
-      </w:tr>
-      <w:tr>
-        <w:trPr>
-          <w:cantSplit/>
-        </w:trPr>
-        <w:tc>
-          <w:tcPr>
-            <w:tcW w:w="1250" w:type="dxa"/>
-          </w:tcPr>
-          <w:p>
-            <w:pPr>
-              <w:spacing w:after="60"/>
-            </w:pPr>
-            <w:r>
-              <w:rPr>
-                <w:color w:val="666666"/>
-                <w:sz w:val="16"/>
-              </w:rPr>
-              <w:t xml:space="preserve">OFF-023</w:t>
+              <w:t xml:space="preserve">Vul uw naam in.</w:t>
+            </w:r>
+          </w:p>
+        </w:tc>
+        <w:tc>
+          <w:tcPr>
+            <w:tcW w:w="5900" w:type="dxa"/>
+            <w:shd w:val="clear" w:color="auto" w:fill="FFFBEA"/>
+          </w:tcPr>
+          <w:p>
+            <w:pPr>
+              <w:spacing w:after="60"/>
+            </w:pPr>
+            <w:r>
+              <w:t xml:space="preserve"/>
+            </w:r>
+          </w:p>
+        </w:tc>
+      </w:tr>
+      <w:tr>
+        <w:trPr>
+          <w:cantSplit/>
+        </w:trPr>
+        <w:tc>
+          <w:tcPr>
+            <w:tcW w:w="1250" w:type="dxa"/>
+          </w:tcPr>
+          <w:p>
+            <w:pPr>
+              <w:spacing w:after="60"/>
+            </w:pPr>
+            <w:r>
+              <w:rPr>
+                <w:color w:val="666666"/>
+                <w:sz w:val="16"/>
+              </w:rPr>
+              <w:t xml:space="preserve">OFF-026</w:t>
+            </w:r>
+          </w:p>
+        </w:tc>
+        <w:tc>
+          <w:tcPr>
+            <w:tcW w:w="1800" w:type="dxa"/>
+          </w:tcPr>
+          <w:p>
+            <w:pPr>
+              <w:spacing w:after="60"/>
+            </w:pPr>
+            <w:r>
+              <w:rPr>
+                <w:color w:val="444444"/>
+                <w:sz w:val="18"/>
+              </w:rPr>
+              <w:t xml:space="preserve">Veldlabel</w:t>
+            </w:r>
+          </w:p>
+        </w:tc>
+        <w:tc>
+          <w:tcPr>
+            <w:tcW w:w="5900" w:type="dxa"/>
+          </w:tcPr>
+          <w:p>
+            <w:pPr>
+              <w:spacing w:after="60"/>
+            </w:pPr>
+            <w:r>
+              <w:t xml:space="preserve">Bedrijf</w:t>
+            </w:r>
+          </w:p>
+        </w:tc>
+        <w:tc>
+          <w:tcPr>
+            <w:tcW w:w="5900" w:type="dxa"/>
+            <w:shd w:val="clear" w:color="auto" w:fill="FFFBEA"/>
+          </w:tcPr>
+          <w:p>
+            <w:pPr>
+              <w:spacing w:after="60"/>
+            </w:pPr>
+            <w:r>
+              <w:t xml:space="preserve"/>
+            </w:r>
+          </w:p>
+        </w:tc>
+      </w:tr>
+      <w:tr>
+        <w:trPr>
+          <w:cantSplit/>
+        </w:trPr>
+        <w:tc>
+          <w:tcPr>
+            <w:tcW w:w="1250" w:type="dxa"/>
+          </w:tcPr>
+          <w:p>
+            <w:pPr>
+              <w:spacing w:after="60"/>
+            </w:pPr>
+            <w:r>
+              <w:rPr>
+                <w:color w:val="666666"/>
+                <w:sz w:val="16"/>
+              </w:rPr>
+              <w:t xml:space="preserve">OFF-027</w:t>
+            </w:r>
+          </w:p>
+        </w:tc>
+        <w:tc>
+          <w:tcPr>
+            <w:tcW w:w="1800" w:type="dxa"/>
+          </w:tcPr>
+          <w:p>
+            <w:pPr>
+              <w:spacing w:after="60"/>
+            </w:pPr>
+            <w:r>
+              <w:rPr>
+                <w:color w:val="444444"/>
+                <w:sz w:val="18"/>
+              </w:rPr>
+              <w:t xml:space="preserve">Tekst</w:t>
+            </w:r>
+          </w:p>
+        </w:tc>
+        <w:tc>
+          <w:tcPr>
+            <w:tcW w:w="5900" w:type="dxa"/>
+          </w:tcPr>
+          <w:p>
+            <w:pPr>
+              <w:spacing w:after="60"/>
+            </w:pPr>
+            <w:r>
+              <w:t xml:space="preserve">Vul uw bedrijfsnaam in.</w:t>
+            </w:r>
+          </w:p>
+        </w:tc>
+        <w:tc>
+          <w:tcPr>
+            <w:tcW w:w="5900" w:type="dxa"/>
+            <w:shd w:val="clear" w:color="auto" w:fill="FFFBEA"/>
+          </w:tcPr>
+          <w:p>
+            <w:pPr>
+              <w:spacing w:after="60"/>
+            </w:pPr>
+            <w:r>
+              <w:t xml:space="preserve"/>
+            </w:r>
+          </w:p>
+        </w:tc>
+      </w:tr>
+      <w:tr>
+        <w:trPr>
+          <w:cantSplit/>
+        </w:trPr>
+        <w:tc>
+          <w:tcPr>
+            <w:tcW w:w="1250" w:type="dxa"/>
+          </w:tcPr>
+          <w:p>
+            <w:pPr>
+              <w:spacing w:after="60"/>
+            </w:pPr>
+            <w:r>
+              <w:rPr>
+                <w:color w:val="666666"/>
+                <w:sz w:val="16"/>
+              </w:rPr>
+              <w:t xml:space="preserve">OFF-028</w:t>
+            </w:r>
+          </w:p>
+        </w:tc>
+        <w:tc>
+          <w:tcPr>
+            <w:tcW w:w="1800" w:type="dxa"/>
+          </w:tcPr>
+          <w:p>
+            <w:pPr>
+              <w:spacing w:after="60"/>
+            </w:pPr>
+            <w:r>
+              <w:rPr>
+                <w:color w:val="444444"/>
+                <w:sz w:val="18"/>
+              </w:rPr>
+              <w:t xml:space="preserve">Veldlabel</w:t>
+            </w:r>
+          </w:p>
+        </w:tc>
+        <w:tc>
+          <w:tcPr>
+            <w:tcW w:w="5900" w:type="dxa"/>
+          </w:tcPr>
+          <w:p>
+            <w:pPr>
+              <w:spacing w:after="60"/>
+            </w:pPr>
+            <w:r>
+              <w:t xml:space="preserve">E-mail</w:t>
+            </w:r>
+          </w:p>
+        </w:tc>
+        <w:tc>
+          <w:tcPr>
+            <w:tcW w:w="5900" w:type="dxa"/>
+            <w:shd w:val="clear" w:color="auto" w:fill="FFFBEA"/>
+          </w:tcPr>
+          <w:p>
+            <w:pPr>
+              <w:spacing w:after="60"/>
+            </w:pPr>
+            <w:r>
+              <w:t xml:space="preserve"/>
+            </w:r>
+          </w:p>
+        </w:tc>
+      </w:tr>
+      <w:tr>
+        <w:trPr>
+          <w:cantSplit/>
+        </w:trPr>
+        <w:tc>
+          <w:tcPr>
+            <w:tcW w:w="1250" w:type="dxa"/>
+          </w:tcPr>
+          <w:p>
+            <w:pPr>
+              <w:spacing w:after="60"/>
+            </w:pPr>
+            <w:r>
+              <w:rPr>
+                <w:color w:val="666666"/>
+                <w:sz w:val="16"/>
+              </w:rPr>
+              <w:t xml:space="preserve">OFF-029</w:t>
+            </w:r>
+          </w:p>
+        </w:tc>
+        <w:tc>
+          <w:tcPr>
+            <w:tcW w:w="1800" w:type="dxa"/>
+          </w:tcPr>
+          <w:p>
+            <w:pPr>
+              <w:spacing w:after="60"/>
+            </w:pPr>
+            <w:r>
+              <w:rPr>
+                <w:color w:val="444444"/>
+                <w:sz w:val="18"/>
+              </w:rPr>
+              <w:t xml:space="preserve">Tekst</w:t>
+            </w:r>
+          </w:p>
+        </w:tc>
+        <w:tc>
+          <w:tcPr>
+            <w:tcW w:w="5900" w:type="dxa"/>
+          </w:tcPr>
+          <w:p>
+            <w:pPr>
+              <w:spacing w:after="60"/>
+            </w:pPr>
+            <w:r>
+              <w:t xml:space="preserve">Vul een geldig e-mailadres in.</w:t>
+            </w:r>
+          </w:p>
+        </w:tc>
+        <w:tc>
+          <w:tcPr>
+            <w:tcW w:w="5900" w:type="dxa"/>
+            <w:shd w:val="clear" w:color="auto" w:fill="FFFBEA"/>
+          </w:tcPr>
+          <w:p>
+            <w:pPr>
+              <w:spacing w:after="60"/>
+            </w:pPr>
+            <w:r>
+              <w:t xml:space="preserve"/>
+            </w:r>
+          </w:p>
+        </w:tc>
+      </w:tr>
+      <w:tr>
+        <w:trPr>
+          <w:cantSplit/>
+        </w:trPr>
+        <w:tc>
+          <w:tcPr>
+            <w:tcW w:w="1250" w:type="dxa"/>
+          </w:tcPr>
+          <w:p>
+            <w:pPr>
+              <w:spacing w:after="60"/>
+            </w:pPr>
+            <w:r>
+              <w:rPr>
+                <w:color w:val="666666"/>
+                <w:sz w:val="16"/>
+              </w:rPr>
+              <w:t xml:space="preserve">OFF-030</w:t>
+            </w:r>
+          </w:p>
+        </w:tc>
+        <w:tc>
+          <w:tcPr>
+            <w:tcW w:w="1800" w:type="dxa"/>
+          </w:tcPr>
+          <w:p>
+            <w:pPr>
+              <w:spacing w:after="60"/>
+            </w:pPr>
+            <w:r>
+              <w:rPr>
+                <w:color w:val="444444"/>
+                <w:sz w:val="18"/>
+              </w:rPr>
+              <w:t xml:space="preserve">Veldlabel</w:t>
+            </w:r>
+          </w:p>
+        </w:tc>
+        <w:tc>
+          <w:tcPr>
+            <w:tcW w:w="5900" w:type="dxa"/>
+          </w:tcPr>
+          <w:p>
+            <w:pPr>
+              <w:spacing w:after="60"/>
+            </w:pPr>
+            <w:r>
+              <w:t xml:space="preserve">Telefoon</w:t>
+            </w:r>
+          </w:p>
+        </w:tc>
+        <w:tc>
+          <w:tcPr>
+            <w:tcW w:w="5900" w:type="dxa"/>
+            <w:shd w:val="clear" w:color="auto" w:fill="FFFBEA"/>
+          </w:tcPr>
+          <w:p>
+            <w:pPr>
+              <w:spacing w:after="60"/>
+            </w:pPr>
+            <w:r>
+              <w:t xml:space="preserve"/>
+            </w:r>
+          </w:p>
+        </w:tc>
+      </w:tr>
+      <w:tr>
+        <w:trPr>
+          <w:cantSplit/>
+        </w:trPr>
+        <w:tc>
+          <w:tcPr>
+            <w:tcW w:w="1250" w:type="dxa"/>
+          </w:tcPr>
+          <w:p>
+            <w:pPr>
+              <w:spacing w:after="60"/>
+            </w:pPr>
+            <w:r>
+              <w:rPr>
+                <w:color w:val="666666"/>
+                <w:sz w:val="16"/>
+              </w:rPr>
+              <w:t xml:space="preserve">OFF-031</w:t>
+            </w:r>
+          </w:p>
+        </w:tc>
+        <w:tc>
+          <w:tcPr>
+            <w:tcW w:w="1800" w:type="dxa"/>
+          </w:tcPr>
+          <w:p>
+            <w:pPr>
+              <w:spacing w:after="60"/>
+            </w:pPr>
+            <w:r>
+              <w:rPr>
+                <w:color w:val="444444"/>
+                <w:sz w:val="18"/>
+              </w:rPr>
+              <w:t xml:space="preserve">Veldlabel</w:t>
+            </w:r>
+          </w:p>
+        </w:tc>
+        <w:tc>
+          <w:tcPr>
+            <w:tcW w:w="5900" w:type="dxa"/>
+          </w:tcPr>
+          <w:p>
+            <w:pPr>
+              <w:spacing w:after="60"/>
+            </w:pPr>
+            <w:r>
+              <w:t xml:space="preserve">(optioneel)</w:t>
+            </w:r>
+          </w:p>
+        </w:tc>
+        <w:tc>
+          <w:tcPr>
+            <w:tcW w:w="5900" w:type="dxa"/>
+            <w:shd w:val="clear" w:color="auto" w:fill="FFFBEA"/>
+          </w:tcPr>
+          <w:p>
+            <w:pPr>
+              <w:spacing w:after="60"/>
+            </w:pPr>
+            <w:r>
+              <w:t xml:space="preserve"/>
+            </w:r>
+          </w:p>
+        </w:tc>
+      </w:tr>
+      <w:tr>
+        <w:trPr>
+          <w:cantSplit/>
+        </w:trPr>
+        <w:tc>
+          <w:tcPr>
+            <w:tcW w:w="1250" w:type="dxa"/>
+          </w:tcPr>
+          <w:p>
+            <w:pPr>
+              <w:spacing w:after="60"/>
+            </w:pPr>
+            <w:r>
+              <w:rPr>
+                <w:color w:val="666666"/>
+                <w:sz w:val="16"/>
+              </w:rPr>
+              <w:t xml:space="preserve">OFF-032</w:t>
+            </w:r>
+          </w:p>
+        </w:tc>
+        <w:tc>
+          <w:tcPr>
+            <w:tcW w:w="1800" w:type="dxa"/>
+          </w:tcPr>
+          <w:p>
+            <w:pPr>
+              <w:spacing w:after="60"/>
+            </w:pPr>
+            <w:r>
+              <w:rPr>
+                <w:color w:val="444444"/>
+                <w:sz w:val="18"/>
+              </w:rPr>
+              <w:t xml:space="preserve">Veldlabel</w:t>
+            </w:r>
+          </w:p>
+        </w:tc>
+        <w:tc>
+          <w:tcPr>
+            <w:tcW w:w="5900" w:type="dxa"/>
+          </w:tcPr>
+          <w:p>
+            <w:pPr>
+              <w:spacing w:after="60"/>
+            </w:pPr>
+            <w:r>
+              <w:t xml:space="preserve">Land</w:t>
+            </w:r>
+          </w:p>
+        </w:tc>
+        <w:tc>
+          <w:tcPr>
+            <w:tcW w:w="5900" w:type="dxa"/>
+            <w:shd w:val="clear" w:color="auto" w:fill="FFFBEA"/>
+          </w:tcPr>
+          <w:p>
+            <w:pPr>
+              <w:spacing w:after="60"/>
+            </w:pPr>
+            <w:r>
+              <w:t xml:space="preserve"/>
+            </w:r>
+          </w:p>
+        </w:tc>
+      </w:tr>
+      <w:tr>
+        <w:trPr>
+          <w:cantSplit/>
+        </w:trPr>
+        <w:tc>
+          <w:tcPr>
+            <w:tcW w:w="1250" w:type="dxa"/>
+          </w:tcPr>
+          <w:p>
+            <w:pPr>
+              <w:spacing w:after="60"/>
+            </w:pPr>
+            <w:r>
+              <w:rPr>
+                <w:color w:val="666666"/>
+                <w:sz w:val="16"/>
+              </w:rPr>
+              <w:t xml:space="preserve">OFF-033</w:t>
+            </w:r>
+          </w:p>
+        </w:tc>
+        <w:tc>
+          <w:tcPr>
+            <w:tcW w:w="1800" w:type="dxa"/>
+          </w:tcPr>
+          <w:p>
+            <w:pPr>
+              <w:spacing w:after="60"/>
+            </w:pPr>
+            <w:r>
+              <w:rPr>
+                <w:color w:val="444444"/>
+                <w:sz w:val="18"/>
+              </w:rPr>
+              <w:t xml:space="preserve">Keuze in lijst</w:t>
+            </w:r>
+          </w:p>
+        </w:tc>
+        <w:tc>
+          <w:tcPr>
+            <w:tcW w:w="5900" w:type="dxa"/>
+          </w:tcPr>
+          <w:p>
+            <w:pPr>
+              <w:spacing w:after="60"/>
+            </w:pPr>
+            <w:r>
+              <w:t xml:space="preserve">België</w:t>
+            </w:r>
+          </w:p>
+        </w:tc>
+        <w:tc>
+          <w:tcPr>
+            <w:tcW w:w="5900" w:type="dxa"/>
+            <w:shd w:val="clear" w:color="auto" w:fill="FFFBEA"/>
+          </w:tcPr>
+          <w:p>
+            <w:pPr>
+              <w:spacing w:after="60"/>
+            </w:pPr>
+            <w:r>
+              <w:t xml:space="preserve"/>
+            </w:r>
+          </w:p>
+        </w:tc>
+      </w:tr>
+      <w:tr>
+        <w:trPr>
+          <w:cantSplit/>
+        </w:trPr>
+        <w:tc>
+          <w:tcPr>
+            <w:tcW w:w="1250" w:type="dxa"/>
+          </w:tcPr>
+          <w:p>
+            <w:pPr>
+              <w:spacing w:after="60"/>
+            </w:pPr>
+            <w:r>
+              <w:rPr>
+                <w:color w:val="666666"/>
+                <w:sz w:val="16"/>
+              </w:rPr>
+              <w:t xml:space="preserve">OFF-034</w:t>
+            </w:r>
+          </w:p>
+        </w:tc>
+        <w:tc>
+          <w:tcPr>
+            <w:tcW w:w="1800" w:type="dxa"/>
+          </w:tcPr>
+          <w:p>
+            <w:pPr>
+              <w:spacing w:after="60"/>
+            </w:pPr>
+            <w:r>
+              <w:rPr>
+                <w:color w:val="444444"/>
+                <w:sz w:val="18"/>
+              </w:rPr>
+              <w:t xml:space="preserve">Keuze in lijst</w:t>
+            </w:r>
+          </w:p>
+        </w:tc>
+        <w:tc>
+          <w:tcPr>
+            <w:tcW w:w="5900" w:type="dxa"/>
+          </w:tcPr>
+          <w:p>
+            <w:pPr>
+              <w:spacing w:after="60"/>
+            </w:pPr>
+            <w:r>
+              <w:t xml:space="preserve">Nederland</w:t>
+            </w:r>
+          </w:p>
+        </w:tc>
+        <w:tc>
+          <w:tcPr>
+            <w:tcW w:w="5900" w:type="dxa"/>
+            <w:shd w:val="clear" w:color="auto" w:fill="FFFBEA"/>
+          </w:tcPr>
+          <w:p>
+            <w:pPr>
+              <w:spacing w:after="60"/>
+            </w:pPr>
+            <w:r>
+              <w:t xml:space="preserve"/>
+            </w:r>
+          </w:p>
+        </w:tc>
+      </w:tr>
+      <w:tr>
+        <w:trPr>
+          <w:cantSplit/>
+        </w:trPr>
+        <w:tc>
+          <w:tcPr>
+            <w:tcW w:w="1250" w:type="dxa"/>
+          </w:tcPr>
+          <w:p>
+            <w:pPr>
+              <w:spacing w:after="60"/>
+            </w:pPr>
+            <w:r>
+              <w:rPr>
+                <w:color w:val="666666"/>
+                <w:sz w:val="16"/>
+              </w:rPr>
+              <w:t xml:space="preserve">OFF-035</w:t>
+            </w:r>
+          </w:p>
+        </w:tc>
+        <w:tc>
+          <w:tcPr>
+            <w:tcW w:w="1800" w:type="dxa"/>
+          </w:tcPr>
+          <w:p>
+            <w:pPr>
+              <w:spacing w:after="60"/>
+            </w:pPr>
+            <w:r>
+              <w:rPr>
+                <w:color w:val="444444"/>
+                <w:sz w:val="18"/>
+              </w:rPr>
+              <w:t xml:space="preserve">Keuze in lijst</w:t>
+            </w:r>
+          </w:p>
+        </w:tc>
+        <w:tc>
+          <w:tcPr>
+            <w:tcW w:w="5900" w:type="dxa"/>
+          </w:tcPr>
+          <w:p>
+            <w:pPr>
+              <w:spacing w:after="60"/>
+            </w:pPr>
+            <w:r>
+              <w:t xml:space="preserve">Luxemburg</w:t>
+            </w:r>
+          </w:p>
+        </w:tc>
+        <w:tc>
+          <w:tcPr>
+            <w:tcW w:w="5900" w:type="dxa"/>
+            <w:shd w:val="clear" w:color="auto" w:fill="FFFBEA"/>
+          </w:tcPr>
+          <w:p>
+            <w:pPr>
+              <w:spacing w:after="60"/>
+            </w:pPr>
+            <w:r>
+              <w:t xml:space="preserve"/>
+            </w:r>
+          </w:p>
+        </w:tc>
+      </w:tr>
+      <w:tr>
+        <w:trPr>
+          <w:cantSplit/>
+        </w:trPr>
+        <w:tc>
+          <w:tcPr>
+            <w:tcW w:w="1250" w:type="dxa"/>
+          </w:tcPr>
+          <w:p>
+            <w:pPr>
+              <w:spacing w:after="60"/>
+            </w:pPr>
+            <w:r>
+              <w:rPr>
+                <w:color w:val="666666"/>
+                <w:sz w:val="16"/>
+              </w:rPr>
+              <w:t xml:space="preserve">OFF-036</w:t>
+            </w:r>
+          </w:p>
+        </w:tc>
+        <w:tc>
+          <w:tcPr>
+            <w:tcW w:w="1800" w:type="dxa"/>
+          </w:tcPr>
+          <w:p>
+            <w:pPr>
+              <w:spacing w:after="60"/>
+            </w:pPr>
+            <w:r>
+              <w:rPr>
+                <w:color w:val="444444"/>
+                <w:sz w:val="18"/>
+              </w:rPr>
+              <w:t xml:space="preserve">Keuze in lijst</w:t>
+            </w:r>
+          </w:p>
+        </w:tc>
+        <w:tc>
+          <w:tcPr>
+            <w:tcW w:w="5900" w:type="dxa"/>
+          </w:tcPr>
+          <w:p>
+            <w:pPr>
+              <w:spacing w:after="60"/>
+            </w:pPr>
+            <w:r>
+              <w:t xml:space="preserve">Frankrijk</w:t>
+            </w:r>
+          </w:p>
+        </w:tc>
+        <w:tc>
+          <w:tcPr>
+            <w:tcW w:w="5900" w:type="dxa"/>
+            <w:shd w:val="clear" w:color="auto" w:fill="FFFBEA"/>
+          </w:tcPr>
+          <w:p>
+            <w:pPr>
+              <w:spacing w:after="60"/>
+            </w:pPr>
+            <w:r>
+              <w:t xml:space="preserve"/>
+            </w:r>
+          </w:p>
+        </w:tc>
+      </w:tr>
+      <w:tr>
+        <w:trPr>
+          <w:cantSplit/>
+        </w:trPr>
+        <w:tc>
+          <w:tcPr>
+            <w:tcW w:w="1250" w:type="dxa"/>
+          </w:tcPr>
+          <w:p>
+            <w:pPr>
+              <w:spacing w:after="60"/>
+            </w:pPr>
+            <w:r>
+              <w:rPr>
+                <w:color w:val="666666"/>
+                <w:sz w:val="16"/>
+              </w:rPr>
+              <w:t xml:space="preserve">OFF-037</w:t>
+            </w:r>
+          </w:p>
+        </w:tc>
+        <w:tc>
+          <w:tcPr>
+            <w:tcW w:w="1800" w:type="dxa"/>
+          </w:tcPr>
+          <w:p>
+            <w:pPr>
+              <w:spacing w:after="60"/>
+            </w:pPr>
+            <w:r>
+              <w:rPr>
+                <w:color w:val="444444"/>
+                <w:sz w:val="18"/>
+              </w:rPr>
+              <w:t xml:space="preserve">Keuze in lijst</w:t>
+            </w:r>
+          </w:p>
+        </w:tc>
+        <w:tc>
+          <w:tcPr>
+            <w:tcW w:w="5900" w:type="dxa"/>
+          </w:tcPr>
+          <w:p>
+            <w:pPr>
+              <w:spacing w:after="60"/>
+            </w:pPr>
+            <w:r>
+              <w:t xml:space="preserve">Duitsland</w:t>
+            </w:r>
+          </w:p>
+        </w:tc>
+        <w:tc>
+          <w:tcPr>
+            <w:tcW w:w="5900" w:type="dxa"/>
+            <w:shd w:val="clear" w:color="auto" w:fill="FFFBEA"/>
+          </w:tcPr>
+          <w:p>
+            <w:pPr>
+              <w:spacing w:after="60"/>
+            </w:pPr>
+            <w:r>
+              <w:t xml:space="preserve"/>
+            </w:r>
+          </w:p>
+        </w:tc>
+      </w:tr>
+      <w:tr>
+        <w:trPr>
+          <w:cantSplit/>
+        </w:trPr>
+        <w:tc>
+          <w:tcPr>
+            <w:tcW w:w="1250" w:type="dxa"/>
+          </w:tcPr>
+          <w:p>
+            <w:pPr>
+              <w:spacing w:after="60"/>
+            </w:pPr>
+            <w:r>
+              <w:rPr>
+                <w:color w:val="666666"/>
+                <w:sz w:val="16"/>
+              </w:rPr>
+              <w:t xml:space="preserve">OFF-038</w:t>
+            </w:r>
+          </w:p>
+        </w:tc>
+        <w:tc>
+          <w:tcPr>
+            <w:tcW w:w="1800" w:type="dxa"/>
+          </w:tcPr>
+          <w:p>
+            <w:pPr>
+              <w:spacing w:after="60"/>
+            </w:pPr>
+            <w:r>
+              <w:rPr>
+                <w:color w:val="444444"/>
+                <w:sz w:val="18"/>
+              </w:rPr>
+              <w:t xml:space="preserve">Keuze in lijst</w:t>
+            </w:r>
+          </w:p>
+        </w:tc>
+        <w:tc>
+          <w:tcPr>
+            <w:tcW w:w="5900" w:type="dxa"/>
+          </w:tcPr>
+          <w:p>
+            <w:pPr>
+              <w:spacing w:after="60"/>
+            </w:pPr>
+            <w:r>
+              <w:t xml:space="preserve">Ander land</w:t>
+            </w:r>
+          </w:p>
+        </w:tc>
+        <w:tc>
+          <w:tcPr>
+            <w:tcW w:w="5900" w:type="dxa"/>
+            <w:shd w:val="clear" w:color="auto" w:fill="FFFBEA"/>
+          </w:tcPr>
+          <w:p>
+            <w:pPr>
+              <w:spacing w:after="60"/>
+            </w:pPr>
+            <w:r>
+              <w:t xml:space="preserve"/>
+            </w:r>
+          </w:p>
+        </w:tc>
+      </w:tr>
+      <w:tr>
+        <w:trPr>
+          <w:cantSplit/>
+        </w:trPr>
+        <w:tc>
+          <w:tcPr>
+            <w:tcW w:w="1250" w:type="dxa"/>
+          </w:tcPr>
+          <w:p>
+            <w:pPr>
+              <w:spacing w:after="60"/>
+            </w:pPr>
+            <w:r>
+              <w:rPr>
+                <w:color w:val="666666"/>
+                <w:sz w:val="16"/>
+              </w:rPr>
+              <w:t xml:space="preserve">OFF-039</w:t>
+            </w:r>
+          </w:p>
+        </w:tc>
+        <w:tc>
+          <w:tcPr>
+            <w:tcW w:w="1800" w:type="dxa"/>
+          </w:tcPr>
+          <w:p>
+            <w:pPr>
+              <w:spacing w:after="60"/>
+            </w:pPr>
+            <w:r>
+              <w:rPr>
+                <w:color w:val="444444"/>
+                <w:sz w:val="18"/>
+              </w:rPr>
+              <w:t xml:space="preserve">Veldlabel</w:t>
+            </w:r>
+          </w:p>
+        </w:tc>
+        <w:tc>
+          <w:tcPr>
+            <w:tcW w:w="5900" w:type="dxa"/>
+          </w:tcPr>
+          <w:p>
+            <w:pPr>
+              <w:spacing w:after="60"/>
+            </w:pPr>
+            <w:r>
+              <w:t xml:space="preserve">Bericht</w:t>
+            </w:r>
+          </w:p>
+        </w:tc>
+        <w:tc>
+          <w:tcPr>
+            <w:tcW w:w="5900" w:type="dxa"/>
+            <w:shd w:val="clear" w:color="auto" w:fill="FFFBEA"/>
+          </w:tcPr>
+          <w:p>
+            <w:pPr>
+              <w:spacing w:after="60"/>
+            </w:pPr>
+            <w:r>
+              <w:t xml:space="preserve"/>
+            </w:r>
+          </w:p>
+        </w:tc>
+      </w:tr>
+      <w:tr>
+        <w:trPr>
+          <w:cantSplit/>
+        </w:trPr>
+        <w:tc>
+          <w:tcPr>
+            <w:tcW w:w="1250" w:type="dxa"/>
+          </w:tcPr>
+          <w:p>
+            <w:pPr>
+              <w:spacing w:after="60"/>
+            </w:pPr>
+            <w:r>
+              <w:rPr>
+                <w:color w:val="666666"/>
+                <w:sz w:val="16"/>
+              </w:rPr>
+              <w:t xml:space="preserve">OFF-040</w:t>
+            </w:r>
+          </w:p>
+        </w:tc>
+        <w:tc>
+          <w:tcPr>
+            <w:tcW w:w="1800" w:type="dxa"/>
+          </w:tcPr>
+          <w:p>
+            <w:pPr>
+              <w:spacing w:after="60"/>
+            </w:pPr>
+            <w:r>
+              <w:rPr>
+                <w:color w:val="444444"/>
+                <w:sz w:val="18"/>
+              </w:rPr>
+              <w:t xml:space="preserve">Tekst</w:t>
+            </w:r>
+          </w:p>
+        </w:tc>
+        <w:tc>
+          <w:tcPr>
+            <w:tcW w:w="5900" w:type="dxa"/>
+          </w:tcPr>
+          <w:p>
+            <w:pPr>
+              <w:spacing w:after="60"/>
+            </w:pPr>
+            <w:r>
+              <w:t xml:space="preserve">Uw selectie staat al bovenaan. Vul aan met uw installatie, aantallen of vragen.</w:t>
+            </w:r>
+          </w:p>
+        </w:tc>
+        <w:tc>
+          <w:tcPr>
+            <w:tcW w:w="5900" w:type="dxa"/>
+            <w:shd w:val="clear" w:color="auto" w:fill="FFFBEA"/>
+          </w:tcPr>
+          <w:p>
+            <w:pPr>
+              <w:spacing w:after="60"/>
+            </w:pPr>
+            <w:r>
+              <w:t xml:space="preserve"/>
+            </w:r>
+          </w:p>
+        </w:tc>
+      </w:tr>
+      <w:tr>
+        <w:trPr>
+          <w:cantSplit/>
+        </w:trPr>
+        <w:tc>
+          <w:tcPr>
+            <w:tcW w:w="1250" w:type="dxa"/>
+          </w:tcPr>
+          <w:p>
+            <w:pPr>
+              <w:spacing w:after="60"/>
+            </w:pPr>
+            <w:r>
+              <w:rPr>
+                <w:color w:val="666666"/>
+                <w:sz w:val="16"/>
+              </w:rPr>
+              <w:t xml:space="preserve">OFF-041</w:t>
+            </w:r>
+          </w:p>
+        </w:tc>
+        <w:tc>
+          <w:tcPr>
+            <w:tcW w:w="1800" w:type="dxa"/>
+          </w:tcPr>
+          <w:p>
+            <w:pPr>
+              <w:spacing w:after="60"/>
+            </w:pPr>
+            <w:r>
+              <w:rPr>
+                <w:color w:val="444444"/>
+                <w:sz w:val="18"/>
+              </w:rPr>
+              <w:t xml:space="preserve">Veldlabel</w:t>
+            </w:r>
+          </w:p>
+        </w:tc>
+        <w:tc>
+          <w:tcPr>
+            <w:tcW w:w="5900" w:type="dxa"/>
+          </w:tcPr>
+          <w:p>
+            <w:pPr>
+              <w:spacing w:after="60"/>
+            </w:pPr>
+            <w:r>
+              <w:t xml:space="preserve">Ik ga akkoord dat Triple R mijn gegevens gebruikt om deze aanvraag te beantwoorden (</w:t>
+            </w:r>
+          </w:p>
+        </w:tc>
+        <w:tc>
+          <w:tcPr>
+            <w:tcW w:w="5900" w:type="dxa"/>
+            <w:shd w:val="clear" w:color="auto" w:fill="FFFBEA"/>
+          </w:tcPr>
+          <w:p>
+            <w:pPr>
+              <w:spacing w:after="60"/>
+            </w:pPr>
+            <w:r>
+              <w:t xml:space="preserve"/>
+            </w:r>
+          </w:p>
+        </w:tc>
+      </w:tr>
+      <w:tr>
+        <w:trPr>
+          <w:cantSplit/>
+        </w:trPr>
+        <w:tc>
+          <w:tcPr>
+            <w:tcW w:w="1250" w:type="dxa"/>
+          </w:tcPr>
+          <w:p>
+            <w:pPr>
+              <w:spacing w:after="60"/>
+            </w:pPr>
+            <w:r>
+              <w:rPr>
+                <w:color w:val="666666"/>
+                <w:sz w:val="16"/>
+              </w:rPr>
+              <w:t xml:space="preserve">OFF-042</w:t>
             </w:r>
           </w:p>
         </w:tc>
@@ -42910,175 +44164,43 @@
               <w:spacing w:after="60"/>
             </w:pPr>
             <w:r>
-              <w:t xml:space="preserve">Bekijk alle producten</w:t>
-            </w:r>
-          </w:p>
-        </w:tc>
-        <w:tc>
-          <w:tcPr>
-            <w:tcW w:w="5900" w:type="dxa"/>
-            <w:shd w:val="clear" w:color="auto" w:fill="FFFBEA"/>
-          </w:tcPr>
-          <w:p>
-            <w:pPr>
-              <w:spacing w:after="60"/>
-            </w:pPr>
-            <w:r>
-              <w:t xml:space="preserve"/>
-            </w:r>
-          </w:p>
-        </w:tc>
-      </w:tr>
-      <w:tr>
-        <w:trPr>
-          <w:cantSplit/>
-        </w:trPr>
-        <w:tc>
-          <w:tcPr>
-            <w:tcW w:w="1250" w:type="dxa"/>
-          </w:tcPr>
-          <w:p>
-            <w:pPr>
-              <w:spacing w:after="60"/>
-            </w:pPr>
-            <w:r>
-              <w:rPr>
-                <w:color w:val="666666"/>
-                <w:sz w:val="16"/>
-              </w:rPr>
-              <w:t xml:space="preserve">OFF-024</w:t>
-            </w:r>
-          </w:p>
-        </w:tc>
-        <w:tc>
-          <w:tcPr>
-            <w:tcW w:w="1800" w:type="dxa"/>
-          </w:tcPr>
-          <w:p>
-            <w:pPr>
-              <w:spacing w:after="60"/>
-            </w:pPr>
-            <w:r>
-              <w:rPr>
-                <w:color w:val="444444"/>
-                <w:sz w:val="18"/>
-              </w:rPr>
-              <w:t xml:space="preserve">Titel</w:t>
-            </w:r>
-          </w:p>
-        </w:tc>
-        <w:tc>
-          <w:tcPr>
-            <w:tcW w:w="5900" w:type="dxa"/>
-          </w:tcPr>
-          <w:p>
-            <w:pPr>
-              <w:spacing w:after="60"/>
-            </w:pPr>
-            <w:r>
-              <w:t xml:space="preserve">Uw gegevens</w:t>
-            </w:r>
-          </w:p>
-        </w:tc>
-        <w:tc>
-          <w:tcPr>
-            <w:tcW w:w="5900" w:type="dxa"/>
-            <w:shd w:val="clear" w:color="auto" w:fill="FFFBEA"/>
-          </w:tcPr>
-          <w:p>
-            <w:pPr>
-              <w:spacing w:after="60"/>
-            </w:pPr>
-            <w:r>
-              <w:t xml:space="preserve"/>
-            </w:r>
-          </w:p>
-        </w:tc>
-      </w:tr>
-      <w:tr>
-        <w:trPr>
-          <w:cantSplit/>
-        </w:trPr>
-        <w:tc>
-          <w:tcPr>
-            <w:tcW w:w="1250" w:type="dxa"/>
-          </w:tcPr>
-          <w:p>
-            <w:pPr>
-              <w:spacing w:after="60"/>
-            </w:pPr>
-            <w:r>
-              <w:rPr>
-                <w:color w:val="666666"/>
-                <w:sz w:val="16"/>
-              </w:rPr>
-              <w:t xml:space="preserve">OFF-025</w:t>
-            </w:r>
-          </w:p>
-        </w:tc>
-        <w:tc>
-          <w:tcPr>
-            <w:tcW w:w="1800" w:type="dxa"/>
-          </w:tcPr>
-          <w:p>
-            <w:pPr>
-              <w:spacing w:after="60"/>
-            </w:pPr>
-            <w:r>
-              <w:rPr>
-                <w:color w:val="444444"/>
-                <w:sz w:val="18"/>
-              </w:rPr>
-              <w:t xml:space="preserve">Veldlabel</w:t>
-            </w:r>
-          </w:p>
-        </w:tc>
-        <w:tc>
-          <w:tcPr>
-            <w:tcW w:w="5900" w:type="dxa"/>
-          </w:tcPr>
-          <w:p>
-            <w:pPr>
-              <w:spacing w:after="60"/>
-            </w:pPr>
-            <w:r>
-              <w:t xml:space="preserve">Naam</w:t>
-            </w:r>
-          </w:p>
-        </w:tc>
-        <w:tc>
-          <w:tcPr>
-            <w:tcW w:w="5900" w:type="dxa"/>
-            <w:shd w:val="clear" w:color="auto" w:fill="FFFBEA"/>
-          </w:tcPr>
-          <w:p>
-            <w:pPr>
-              <w:spacing w:after="60"/>
-            </w:pPr>
-            <w:r>
-              <w:t xml:space="preserve"/>
-            </w:r>
-          </w:p>
-        </w:tc>
-      </w:tr>
-      <w:tr>
-        <w:trPr>
-          <w:cantSplit/>
-        </w:trPr>
-        <w:tc>
-          <w:tcPr>
-            <w:tcW w:w="1250" w:type="dxa"/>
-          </w:tcPr>
-          <w:p>
-            <w:pPr>
-              <w:spacing w:after="60"/>
-            </w:pPr>
-            <w:r>
-              <w:rPr>
-                <w:color w:val="666666"/>
-                <w:sz w:val="16"/>
-              </w:rPr>
-              <w:t xml:space="preserve">OFF-026</w:t>
+              <w:t xml:space="preserve">privacybeleid</w:t>
+            </w:r>
+          </w:p>
+        </w:tc>
+        <w:tc>
+          <w:tcPr>
+            <w:tcW w:w="5900" w:type="dxa"/>
+            <w:shd w:val="clear" w:color="auto" w:fill="FFFBEA"/>
+          </w:tcPr>
+          <w:p>
+            <w:pPr>
+              <w:spacing w:after="60"/>
+            </w:pPr>
+            <w:r>
+              <w:t xml:space="preserve"/>
+            </w:r>
+          </w:p>
+        </w:tc>
+      </w:tr>
+      <w:tr>
+        <w:trPr>
+          <w:cantSplit/>
+        </w:trPr>
+        <w:tc>
+          <w:tcPr>
+            <w:tcW w:w="1250" w:type="dxa"/>
+          </w:tcPr>
+          <w:p>
+            <w:pPr>
+              <w:spacing w:after="60"/>
+            </w:pPr>
+            <w:r>
+              <w:rPr>
+                <w:color w:val="666666"/>
+                <w:sz w:val="16"/>
+              </w:rPr>
+              <w:t xml:space="preserve">OFF-043</w:t>
             </w:r>
           </w:p>
         </w:tc>
@@ -43108,1129 +44230,7 @@
               <w:spacing w:after="60"/>
             </w:pPr>
             <w:r>
-              <w:t xml:space="preserve">Vul uw naam in.</w:t>
-            </w:r>
-          </w:p>
-        </w:tc>
-        <w:tc>
-          <w:tcPr>
-            <w:tcW w:w="5900" w:type="dxa"/>
-            <w:shd w:val="clear" w:color="auto" w:fill="FFFBEA"/>
-          </w:tcPr>
-          <w:p>
-            <w:pPr>
-              <w:spacing w:after="60"/>
-            </w:pPr>
-            <w:r>
-              <w:t xml:space="preserve"/>
-            </w:r>
-          </w:p>
-        </w:tc>
-      </w:tr>
-      <w:tr>
-        <w:trPr>
-          <w:cantSplit/>
-        </w:trPr>
-        <w:tc>
-          <w:tcPr>
-            <w:tcW w:w="1250" w:type="dxa"/>
-          </w:tcPr>
-          <w:p>
-            <w:pPr>
-              <w:spacing w:after="60"/>
-            </w:pPr>
-            <w:r>
-              <w:rPr>
-                <w:color w:val="666666"/>
-                <w:sz w:val="16"/>
-              </w:rPr>
-              <w:t xml:space="preserve">OFF-027</w:t>
-            </w:r>
-          </w:p>
-        </w:tc>
-        <w:tc>
-          <w:tcPr>
-            <w:tcW w:w="1800" w:type="dxa"/>
-          </w:tcPr>
-          <w:p>
-            <w:pPr>
-              <w:spacing w:after="60"/>
-            </w:pPr>
-            <w:r>
-              <w:rPr>
-                <w:color w:val="444444"/>
-                <w:sz w:val="18"/>
-              </w:rPr>
-              <w:t xml:space="preserve">Veldlabel</w:t>
-            </w:r>
-          </w:p>
-        </w:tc>
-        <w:tc>
-          <w:tcPr>
-            <w:tcW w:w="5900" w:type="dxa"/>
-          </w:tcPr>
-          <w:p>
-            <w:pPr>
-              <w:spacing w:after="60"/>
-            </w:pPr>
-            <w:r>
-              <w:t xml:space="preserve">Bedrijf</w:t>
-            </w:r>
-          </w:p>
-        </w:tc>
-        <w:tc>
-          <w:tcPr>
-            <w:tcW w:w="5900" w:type="dxa"/>
-            <w:shd w:val="clear" w:color="auto" w:fill="FFFBEA"/>
-          </w:tcPr>
-          <w:p>
-            <w:pPr>
-              <w:spacing w:after="60"/>
-            </w:pPr>
-            <w:r>
-              <w:t xml:space="preserve"/>
-            </w:r>
-          </w:p>
-        </w:tc>
-      </w:tr>
-      <w:tr>
-        <w:trPr>
-          <w:cantSplit/>
-        </w:trPr>
-        <w:tc>
-          <w:tcPr>
-            <w:tcW w:w="1250" w:type="dxa"/>
-          </w:tcPr>
-          <w:p>
-            <w:pPr>
-              <w:spacing w:after="60"/>
-            </w:pPr>
-            <w:r>
-              <w:rPr>
-                <w:color w:val="666666"/>
-                <w:sz w:val="16"/>
-              </w:rPr>
-              <w:t xml:space="preserve">OFF-028</w:t>
-            </w:r>
-          </w:p>
-        </w:tc>
-        <w:tc>
-          <w:tcPr>
-            <w:tcW w:w="1800" w:type="dxa"/>
-          </w:tcPr>
-          <w:p>
-            <w:pPr>
-              <w:spacing w:after="60"/>
-            </w:pPr>
-            <w:r>
-              <w:rPr>
-                <w:color w:val="444444"/>
-                <w:sz w:val="18"/>
-              </w:rPr>
-              <w:t xml:space="preserve">Tekst</w:t>
-            </w:r>
-          </w:p>
-        </w:tc>
-        <w:tc>
-          <w:tcPr>
-            <w:tcW w:w="5900" w:type="dxa"/>
-          </w:tcPr>
-          <w:p>
-            <w:pPr>
-              <w:spacing w:after="60"/>
-            </w:pPr>
-            <w:r>
-              <w:t xml:space="preserve">Vul uw bedrijfsnaam in.</w:t>
-            </w:r>
-          </w:p>
-        </w:tc>
-        <w:tc>
-          <w:tcPr>
-            <w:tcW w:w="5900" w:type="dxa"/>
-            <w:shd w:val="clear" w:color="auto" w:fill="FFFBEA"/>
-          </w:tcPr>
-          <w:p>
-            <w:pPr>
-              <w:spacing w:after="60"/>
-            </w:pPr>
-            <w:r>
-              <w:t xml:space="preserve"/>
-            </w:r>
-          </w:p>
-        </w:tc>
-      </w:tr>
-      <w:tr>
-        <w:trPr>
-          <w:cantSplit/>
-        </w:trPr>
-        <w:tc>
-          <w:tcPr>
-            <w:tcW w:w="1250" w:type="dxa"/>
-          </w:tcPr>
-          <w:p>
-            <w:pPr>
-              <w:spacing w:after="60"/>
-            </w:pPr>
-            <w:r>
-              <w:rPr>
-                <w:color w:val="666666"/>
-                <w:sz w:val="16"/>
-              </w:rPr>
-              <w:t xml:space="preserve">OFF-029</w:t>
-            </w:r>
-          </w:p>
-        </w:tc>
-        <w:tc>
-          <w:tcPr>
-            <w:tcW w:w="1800" w:type="dxa"/>
-          </w:tcPr>
-          <w:p>
-            <w:pPr>
-              <w:spacing w:after="60"/>
-            </w:pPr>
-            <w:r>
-              <w:rPr>
-                <w:color w:val="444444"/>
-                <w:sz w:val="18"/>
-              </w:rPr>
-              <w:t xml:space="preserve">Veldlabel</w:t>
-            </w:r>
-          </w:p>
-        </w:tc>
-        <w:tc>
-          <w:tcPr>
-            <w:tcW w:w="5900" w:type="dxa"/>
-          </w:tcPr>
-          <w:p>
-            <w:pPr>
-              <w:spacing w:after="60"/>
-            </w:pPr>
-            <w:r>
-              <w:t xml:space="preserve">E-mail</w:t>
-            </w:r>
-          </w:p>
-        </w:tc>
-        <w:tc>
-          <w:tcPr>
-            <w:tcW w:w="5900" w:type="dxa"/>
-            <w:shd w:val="clear" w:color="auto" w:fill="FFFBEA"/>
-          </w:tcPr>
-          <w:p>
-            <w:pPr>
-              <w:spacing w:after="60"/>
-            </w:pPr>
-            <w:r>
-              <w:t xml:space="preserve"/>
-            </w:r>
-          </w:p>
-        </w:tc>
-      </w:tr>
-      <w:tr>
-        <w:trPr>
-          <w:cantSplit/>
-        </w:trPr>
-        <w:tc>
-          <w:tcPr>
-            <w:tcW w:w="1250" w:type="dxa"/>
-          </w:tcPr>
-          <w:p>
-            <w:pPr>
-              <w:spacing w:after="60"/>
-            </w:pPr>
-            <w:r>
-              <w:rPr>
-                <w:color w:val="666666"/>
-                <w:sz w:val="16"/>
-              </w:rPr>
-              <w:t xml:space="preserve">OFF-030</w:t>
-            </w:r>
-          </w:p>
-        </w:tc>
-        <w:tc>
-          <w:tcPr>
-            <w:tcW w:w="1800" w:type="dxa"/>
-          </w:tcPr>
-          <w:p>
-            <w:pPr>
-              <w:spacing w:after="60"/>
-            </w:pPr>
-            <w:r>
-              <w:rPr>
-                <w:color w:val="444444"/>
-                <w:sz w:val="18"/>
-              </w:rPr>
-              <w:t xml:space="preserve">Tekst</w:t>
-            </w:r>
-          </w:p>
-        </w:tc>
-        <w:tc>
-          <w:tcPr>
-            <w:tcW w:w="5900" w:type="dxa"/>
-          </w:tcPr>
-          <w:p>
-            <w:pPr>
-              <w:spacing w:after="60"/>
-            </w:pPr>
-            <w:r>
-              <w:t xml:space="preserve">Vul een geldig e-mailadres in.</w:t>
-            </w:r>
-          </w:p>
-        </w:tc>
-        <w:tc>
-          <w:tcPr>
-            <w:tcW w:w="5900" w:type="dxa"/>
-            <w:shd w:val="clear" w:color="auto" w:fill="FFFBEA"/>
-          </w:tcPr>
-          <w:p>
-            <w:pPr>
-              <w:spacing w:after="60"/>
-            </w:pPr>
-            <w:r>
-              <w:t xml:space="preserve"/>
-            </w:r>
-          </w:p>
-        </w:tc>
-      </w:tr>
-      <w:tr>
-        <w:trPr>
-          <w:cantSplit/>
-        </w:trPr>
-        <w:tc>
-          <w:tcPr>
-            <w:tcW w:w="1250" w:type="dxa"/>
-          </w:tcPr>
-          <w:p>
-            <w:pPr>
-              <w:spacing w:after="60"/>
-            </w:pPr>
-            <w:r>
-              <w:rPr>
-                <w:color w:val="666666"/>
-                <w:sz w:val="16"/>
-              </w:rPr>
-              <w:t xml:space="preserve">OFF-031</w:t>
-            </w:r>
-          </w:p>
-        </w:tc>
-        <w:tc>
-          <w:tcPr>
-            <w:tcW w:w="1800" w:type="dxa"/>
-          </w:tcPr>
-          <w:p>
-            <w:pPr>
-              <w:spacing w:after="60"/>
-            </w:pPr>
-            <w:r>
-              <w:rPr>
-                <w:color w:val="444444"/>
-                <w:sz w:val="18"/>
-              </w:rPr>
-              <w:t xml:space="preserve">Veldlabel</w:t>
-            </w:r>
-          </w:p>
-        </w:tc>
-        <w:tc>
-          <w:tcPr>
-            <w:tcW w:w="5900" w:type="dxa"/>
-          </w:tcPr>
-          <w:p>
-            <w:pPr>
-              <w:spacing w:after="60"/>
-            </w:pPr>
-            <w:r>
-              <w:t xml:space="preserve">Telefoon</w:t>
-            </w:r>
-          </w:p>
-        </w:tc>
-        <w:tc>
-          <w:tcPr>
-            <w:tcW w:w="5900" w:type="dxa"/>
-            <w:shd w:val="clear" w:color="auto" w:fill="FFFBEA"/>
-          </w:tcPr>
-          <w:p>
-            <w:pPr>
-              <w:spacing w:after="60"/>
-            </w:pPr>
-            <w:r>
-              <w:t xml:space="preserve"/>
-            </w:r>
-          </w:p>
-        </w:tc>
-      </w:tr>
-      <w:tr>
-        <w:trPr>
-          <w:cantSplit/>
-        </w:trPr>
-        <w:tc>
-          <w:tcPr>
-            <w:tcW w:w="1250" w:type="dxa"/>
-          </w:tcPr>
-          <w:p>
-            <w:pPr>
-              <w:spacing w:after="60"/>
-            </w:pPr>
-            <w:r>
-              <w:rPr>
-                <w:color w:val="666666"/>
-                <w:sz w:val="16"/>
-              </w:rPr>
-              <w:t xml:space="preserve">OFF-032</w:t>
-            </w:r>
-          </w:p>
-        </w:tc>
-        <w:tc>
-          <w:tcPr>
-            <w:tcW w:w="1800" w:type="dxa"/>
-          </w:tcPr>
-          <w:p>
-            <w:pPr>
-              <w:spacing w:after="60"/>
-            </w:pPr>
-            <w:r>
-              <w:rPr>
-                <w:color w:val="444444"/>
-                <w:sz w:val="18"/>
-              </w:rPr>
-              <w:t xml:space="preserve">Veldlabel</w:t>
-            </w:r>
-          </w:p>
-        </w:tc>
-        <w:tc>
-          <w:tcPr>
-            <w:tcW w:w="5900" w:type="dxa"/>
-          </w:tcPr>
-          <w:p>
-            <w:pPr>
-              <w:spacing w:after="60"/>
-            </w:pPr>
-            <w:r>
-              <w:t xml:space="preserve">(optioneel)</w:t>
-            </w:r>
-          </w:p>
-        </w:tc>
-        <w:tc>
-          <w:tcPr>
-            <w:tcW w:w="5900" w:type="dxa"/>
-            <w:shd w:val="clear" w:color="auto" w:fill="FFFBEA"/>
-          </w:tcPr>
-          <w:p>
-            <w:pPr>
-              <w:spacing w:after="60"/>
-            </w:pPr>
-            <w:r>
-              <w:t xml:space="preserve"/>
-            </w:r>
-          </w:p>
-        </w:tc>
-      </w:tr>
-      <w:tr>
-        <w:trPr>
-          <w:cantSplit/>
-        </w:trPr>
-        <w:tc>
-          <w:tcPr>
-            <w:tcW w:w="1250" w:type="dxa"/>
-          </w:tcPr>
-          <w:p>
-            <w:pPr>
-              <w:spacing w:after="60"/>
-            </w:pPr>
-            <w:r>
-              <w:rPr>
-                <w:color w:val="666666"/>
-                <w:sz w:val="16"/>
-              </w:rPr>
-              <w:t xml:space="preserve">OFF-033</w:t>
-            </w:r>
-          </w:p>
-        </w:tc>
-        <w:tc>
-          <w:tcPr>
-            <w:tcW w:w="1800" w:type="dxa"/>
-          </w:tcPr>
-          <w:p>
-            <w:pPr>
-              <w:spacing w:after="60"/>
-            </w:pPr>
-            <w:r>
-              <w:rPr>
-                <w:color w:val="444444"/>
-                <w:sz w:val="18"/>
-              </w:rPr>
-              <w:t xml:space="preserve">Veldlabel</w:t>
-            </w:r>
-          </w:p>
-        </w:tc>
-        <w:tc>
-          <w:tcPr>
-            <w:tcW w:w="5900" w:type="dxa"/>
-          </w:tcPr>
-          <w:p>
-            <w:pPr>
-              <w:spacing w:after="60"/>
-            </w:pPr>
-            <w:r>
-              <w:t xml:space="preserve">Land</w:t>
-            </w:r>
-          </w:p>
-        </w:tc>
-        <w:tc>
-          <w:tcPr>
-            <w:tcW w:w="5900" w:type="dxa"/>
-            <w:shd w:val="clear" w:color="auto" w:fill="FFFBEA"/>
-          </w:tcPr>
-          <w:p>
-            <w:pPr>
-              <w:spacing w:after="60"/>
-            </w:pPr>
-            <w:r>
-              <w:t xml:space="preserve"/>
-            </w:r>
-          </w:p>
-        </w:tc>
-      </w:tr>
-      <w:tr>
-        <w:trPr>
-          <w:cantSplit/>
-        </w:trPr>
-        <w:tc>
-          <w:tcPr>
-            <w:tcW w:w="1250" w:type="dxa"/>
-          </w:tcPr>
-          <w:p>
-            <w:pPr>
-              <w:spacing w:after="60"/>
-            </w:pPr>
-            <w:r>
-              <w:rPr>
-                <w:color w:val="666666"/>
-                <w:sz w:val="16"/>
-              </w:rPr>
-              <w:t xml:space="preserve">OFF-034</w:t>
-            </w:r>
-          </w:p>
-        </w:tc>
-        <w:tc>
-          <w:tcPr>
-            <w:tcW w:w="1800" w:type="dxa"/>
-          </w:tcPr>
-          <w:p>
-            <w:pPr>
-              <w:spacing w:after="60"/>
-            </w:pPr>
-            <w:r>
-              <w:rPr>
-                <w:color w:val="444444"/>
-                <w:sz w:val="18"/>
-              </w:rPr>
-              <w:t xml:space="preserve">Keuze in lijst</w:t>
-            </w:r>
-          </w:p>
-        </w:tc>
-        <w:tc>
-          <w:tcPr>
-            <w:tcW w:w="5900" w:type="dxa"/>
-          </w:tcPr>
-          <w:p>
-            <w:pPr>
-              <w:spacing w:after="60"/>
-            </w:pPr>
-            <w:r>
-              <w:t xml:space="preserve">België</w:t>
-            </w:r>
-          </w:p>
-        </w:tc>
-        <w:tc>
-          <w:tcPr>
-            <w:tcW w:w="5900" w:type="dxa"/>
-            <w:shd w:val="clear" w:color="auto" w:fill="FFFBEA"/>
-          </w:tcPr>
-          <w:p>
-            <w:pPr>
-              <w:spacing w:after="60"/>
-            </w:pPr>
-            <w:r>
-              <w:t xml:space="preserve"/>
-            </w:r>
-          </w:p>
-        </w:tc>
-      </w:tr>
-      <w:tr>
-        <w:trPr>
-          <w:cantSplit/>
-        </w:trPr>
-        <w:tc>
-          <w:tcPr>
-            <w:tcW w:w="1250" w:type="dxa"/>
-          </w:tcPr>
-          <w:p>
-            <w:pPr>
-              <w:spacing w:after="60"/>
-            </w:pPr>
-            <w:r>
-              <w:rPr>
-                <w:color w:val="666666"/>
-                <w:sz w:val="16"/>
-              </w:rPr>
-              <w:t xml:space="preserve">OFF-035</w:t>
-            </w:r>
-          </w:p>
-        </w:tc>
-        <w:tc>
-          <w:tcPr>
-            <w:tcW w:w="1800" w:type="dxa"/>
-          </w:tcPr>
-          <w:p>
-            <w:pPr>
-              <w:spacing w:after="60"/>
-            </w:pPr>
-            <w:r>
-              <w:rPr>
-                <w:color w:val="444444"/>
-                <w:sz w:val="18"/>
-              </w:rPr>
-              <w:t xml:space="preserve">Keuze in lijst</w:t>
-            </w:r>
-          </w:p>
-        </w:tc>
-        <w:tc>
-          <w:tcPr>
-            <w:tcW w:w="5900" w:type="dxa"/>
-          </w:tcPr>
-          <w:p>
-            <w:pPr>
-              <w:spacing w:after="60"/>
-            </w:pPr>
-            <w:r>
-              <w:t xml:space="preserve">Nederland</w:t>
-            </w:r>
-          </w:p>
-        </w:tc>
-        <w:tc>
-          <w:tcPr>
-            <w:tcW w:w="5900" w:type="dxa"/>
-            <w:shd w:val="clear" w:color="auto" w:fill="FFFBEA"/>
-          </w:tcPr>
-          <w:p>
-            <w:pPr>
-              <w:spacing w:after="60"/>
-            </w:pPr>
-            <w:r>
-              <w:t xml:space="preserve"/>
-            </w:r>
-          </w:p>
-        </w:tc>
-      </w:tr>
-      <w:tr>
-        <w:trPr>
-          <w:cantSplit/>
-        </w:trPr>
-        <w:tc>
-          <w:tcPr>
-            <w:tcW w:w="1250" w:type="dxa"/>
-          </w:tcPr>
-          <w:p>
-            <w:pPr>
-              <w:spacing w:after="60"/>
-            </w:pPr>
-            <w:r>
-              <w:rPr>
-                <w:color w:val="666666"/>
-                <w:sz w:val="16"/>
-              </w:rPr>
-              <w:t xml:space="preserve">OFF-036</w:t>
-            </w:r>
-          </w:p>
-        </w:tc>
-        <w:tc>
-          <w:tcPr>
-            <w:tcW w:w="1800" w:type="dxa"/>
-          </w:tcPr>
-          <w:p>
-            <w:pPr>
-              <w:spacing w:after="60"/>
-            </w:pPr>
-            <w:r>
-              <w:rPr>
-                <w:color w:val="444444"/>
-                <w:sz w:val="18"/>
-              </w:rPr>
-              <w:t xml:space="preserve">Keuze in lijst</w:t>
-            </w:r>
-          </w:p>
-        </w:tc>
-        <w:tc>
-          <w:tcPr>
-            <w:tcW w:w="5900" w:type="dxa"/>
-          </w:tcPr>
-          <w:p>
-            <w:pPr>
-              <w:spacing w:after="60"/>
-            </w:pPr>
-            <w:r>
-              <w:t xml:space="preserve">Luxemburg</w:t>
-            </w:r>
-          </w:p>
-        </w:tc>
-        <w:tc>
-          <w:tcPr>
-            <w:tcW w:w="5900" w:type="dxa"/>
-            <w:shd w:val="clear" w:color="auto" w:fill="FFFBEA"/>
-          </w:tcPr>
-          <w:p>
-            <w:pPr>
-              <w:spacing w:after="60"/>
-            </w:pPr>
-            <w:r>
-              <w:t xml:space="preserve"/>
-            </w:r>
-          </w:p>
-        </w:tc>
-      </w:tr>
-      <w:tr>
-        <w:trPr>
-          <w:cantSplit/>
-        </w:trPr>
-        <w:tc>
-          <w:tcPr>
-            <w:tcW w:w="1250" w:type="dxa"/>
-          </w:tcPr>
-          <w:p>
-            <w:pPr>
-              <w:spacing w:after="60"/>
-            </w:pPr>
-            <w:r>
-              <w:rPr>
-                <w:color w:val="666666"/>
-                <w:sz w:val="16"/>
-              </w:rPr>
-              <w:t xml:space="preserve">OFF-037</w:t>
-            </w:r>
-          </w:p>
-        </w:tc>
-        <w:tc>
-          <w:tcPr>
-            <w:tcW w:w="1800" w:type="dxa"/>
-          </w:tcPr>
-          <w:p>
-            <w:pPr>
-              <w:spacing w:after="60"/>
-            </w:pPr>
-            <w:r>
-              <w:rPr>
-                <w:color w:val="444444"/>
-                <w:sz w:val="18"/>
-              </w:rPr>
-              <w:t xml:space="preserve">Keuze in lijst</w:t>
-            </w:r>
-          </w:p>
-        </w:tc>
-        <w:tc>
-          <w:tcPr>
-            <w:tcW w:w="5900" w:type="dxa"/>
-          </w:tcPr>
-          <w:p>
-            <w:pPr>
-              <w:spacing w:after="60"/>
-            </w:pPr>
-            <w:r>
-              <w:t xml:space="preserve">Frankrijk</w:t>
-            </w:r>
-          </w:p>
-        </w:tc>
-        <w:tc>
-          <w:tcPr>
-            <w:tcW w:w="5900" w:type="dxa"/>
-            <w:shd w:val="clear" w:color="auto" w:fill="FFFBEA"/>
-          </w:tcPr>
-          <w:p>
-            <w:pPr>
-              <w:spacing w:after="60"/>
-            </w:pPr>
-            <w:r>
-              <w:t xml:space="preserve"/>
-            </w:r>
-          </w:p>
-        </w:tc>
-      </w:tr>
-      <w:tr>
-        <w:trPr>
-          <w:cantSplit/>
-        </w:trPr>
-        <w:tc>
-          <w:tcPr>
-            <w:tcW w:w="1250" w:type="dxa"/>
-          </w:tcPr>
-          <w:p>
-            <w:pPr>
-              <w:spacing w:after="60"/>
-            </w:pPr>
-            <w:r>
-              <w:rPr>
-                <w:color w:val="666666"/>
-                <w:sz w:val="16"/>
-              </w:rPr>
-              <w:t xml:space="preserve">OFF-038</w:t>
-            </w:r>
-          </w:p>
-        </w:tc>
-        <w:tc>
-          <w:tcPr>
-            <w:tcW w:w="1800" w:type="dxa"/>
-          </w:tcPr>
-          <w:p>
-            <w:pPr>
-              <w:spacing w:after="60"/>
-            </w:pPr>
-            <w:r>
-              <w:rPr>
-                <w:color w:val="444444"/>
-                <w:sz w:val="18"/>
-              </w:rPr>
-              <w:t xml:space="preserve">Keuze in lijst</w:t>
-            </w:r>
-          </w:p>
-        </w:tc>
-        <w:tc>
-          <w:tcPr>
-            <w:tcW w:w="5900" w:type="dxa"/>
-          </w:tcPr>
-          <w:p>
-            <w:pPr>
-              <w:spacing w:after="60"/>
-            </w:pPr>
-            <w:r>
-              <w:t xml:space="preserve">Duitsland</w:t>
-            </w:r>
-          </w:p>
-        </w:tc>
-        <w:tc>
-          <w:tcPr>
-            <w:tcW w:w="5900" w:type="dxa"/>
-            <w:shd w:val="clear" w:color="auto" w:fill="FFFBEA"/>
-          </w:tcPr>
-          <w:p>
-            <w:pPr>
-              <w:spacing w:after="60"/>
-            </w:pPr>
-            <w:r>
-              <w:t xml:space="preserve"/>
-            </w:r>
-          </w:p>
-        </w:tc>
-      </w:tr>
-      <w:tr>
-        <w:trPr>
-          <w:cantSplit/>
-        </w:trPr>
-        <w:tc>
-          <w:tcPr>
-            <w:tcW w:w="1250" w:type="dxa"/>
-          </w:tcPr>
-          <w:p>
-            <w:pPr>
-              <w:spacing w:after="60"/>
-            </w:pPr>
-            <w:r>
-              <w:rPr>
-                <w:color w:val="666666"/>
-                <w:sz w:val="16"/>
-              </w:rPr>
-              <w:t xml:space="preserve">OFF-039</w:t>
-            </w:r>
-          </w:p>
-        </w:tc>
-        <w:tc>
-          <w:tcPr>
-            <w:tcW w:w="1800" w:type="dxa"/>
-          </w:tcPr>
-          <w:p>
-            <w:pPr>
-              <w:spacing w:after="60"/>
-            </w:pPr>
-            <w:r>
-              <w:rPr>
-                <w:color w:val="444444"/>
-                <w:sz w:val="18"/>
-              </w:rPr>
-              <w:t xml:space="preserve">Keuze in lijst</w:t>
-            </w:r>
-          </w:p>
-        </w:tc>
-        <w:tc>
-          <w:tcPr>
-            <w:tcW w:w="5900" w:type="dxa"/>
-          </w:tcPr>
-          <w:p>
-            <w:pPr>
-              <w:spacing w:after="60"/>
-            </w:pPr>
-            <w:r>
-              <w:t xml:space="preserve">Ander land</w:t>
-            </w:r>
-          </w:p>
-        </w:tc>
-        <w:tc>
-          <w:tcPr>
-            <w:tcW w:w="5900" w:type="dxa"/>
-            <w:shd w:val="clear" w:color="auto" w:fill="FFFBEA"/>
-          </w:tcPr>
-          <w:p>
-            <w:pPr>
-              <w:spacing w:after="60"/>
-            </w:pPr>
-            <w:r>
-              <w:t xml:space="preserve"/>
-            </w:r>
-          </w:p>
-        </w:tc>
-      </w:tr>
-      <w:tr>
-        <w:trPr>
-          <w:cantSplit/>
-        </w:trPr>
-        <w:tc>
-          <w:tcPr>
-            <w:tcW w:w="1250" w:type="dxa"/>
-          </w:tcPr>
-          <w:p>
-            <w:pPr>
-              <w:spacing w:after="60"/>
-            </w:pPr>
-            <w:r>
-              <w:rPr>
-                <w:color w:val="666666"/>
-                <w:sz w:val="16"/>
-              </w:rPr>
-              <w:t xml:space="preserve">OFF-040</w:t>
-            </w:r>
-          </w:p>
-        </w:tc>
-        <w:tc>
-          <w:tcPr>
-            <w:tcW w:w="1800" w:type="dxa"/>
-          </w:tcPr>
-          <w:p>
-            <w:pPr>
-              <w:spacing w:after="60"/>
-            </w:pPr>
-            <w:r>
-              <w:rPr>
-                <w:color w:val="444444"/>
-                <w:sz w:val="18"/>
-              </w:rPr>
-              <w:t xml:space="preserve">Veldlabel</w:t>
-            </w:r>
-          </w:p>
-        </w:tc>
-        <w:tc>
-          <w:tcPr>
-            <w:tcW w:w="5900" w:type="dxa"/>
-          </w:tcPr>
-          <w:p>
-            <w:pPr>
-              <w:spacing w:after="60"/>
-            </w:pPr>
-            <w:r>
-              <w:t xml:space="preserve">Bericht</w:t>
-            </w:r>
-          </w:p>
-        </w:tc>
-        <w:tc>
-          <w:tcPr>
-            <w:tcW w:w="5900" w:type="dxa"/>
-            <w:shd w:val="clear" w:color="auto" w:fill="FFFBEA"/>
-          </w:tcPr>
-          <w:p>
-            <w:pPr>
-              <w:spacing w:after="60"/>
-            </w:pPr>
-            <w:r>
-              <w:t xml:space="preserve"/>
-            </w:r>
-          </w:p>
-        </w:tc>
-      </w:tr>
-      <w:tr>
-        <w:trPr>
-          <w:cantSplit/>
-        </w:trPr>
-        <w:tc>
-          <w:tcPr>
-            <w:tcW w:w="1250" w:type="dxa"/>
-          </w:tcPr>
-          <w:p>
-            <w:pPr>
-              <w:spacing w:after="60"/>
-            </w:pPr>
-            <w:r>
-              <w:rPr>
-                <w:color w:val="666666"/>
-                <w:sz w:val="16"/>
-              </w:rPr>
-              <w:t xml:space="preserve">OFF-041</w:t>
-            </w:r>
-          </w:p>
-        </w:tc>
-        <w:tc>
-          <w:tcPr>
-            <w:tcW w:w="1800" w:type="dxa"/>
-          </w:tcPr>
-          <w:p>
-            <w:pPr>
-              <w:spacing w:after="60"/>
-            </w:pPr>
-            <w:r>
-              <w:rPr>
-                <w:color w:val="444444"/>
-                <w:sz w:val="18"/>
-              </w:rPr>
-              <w:t xml:space="preserve">Tekst</w:t>
-            </w:r>
-          </w:p>
-        </w:tc>
-        <w:tc>
-          <w:tcPr>
-            <w:tcW w:w="5900" w:type="dxa"/>
-          </w:tcPr>
-          <w:p>
-            <w:pPr>
-              <w:spacing w:after="60"/>
-            </w:pPr>
-            <w:r>
-              <w:t xml:space="preserve">Uw selectie staat al bovenaan. Vul aan met uw installatie, aantallen of vragen.</w:t>
-            </w:r>
-          </w:p>
-        </w:tc>
-        <w:tc>
-          <w:tcPr>
-            <w:tcW w:w="5900" w:type="dxa"/>
-            <w:shd w:val="clear" w:color="auto" w:fill="FFFBEA"/>
-          </w:tcPr>
-          <w:p>
-            <w:pPr>
-              <w:spacing w:after="60"/>
-            </w:pPr>
-            <w:r>
-              <w:t xml:space="preserve"/>
-            </w:r>
-          </w:p>
-        </w:tc>
-      </w:tr>
-      <w:tr>
-        <w:trPr>
-          <w:cantSplit/>
-        </w:trPr>
-        <w:tc>
-          <w:tcPr>
-            <w:tcW w:w="1250" w:type="dxa"/>
-          </w:tcPr>
-          <w:p>
-            <w:pPr>
-              <w:spacing w:after="60"/>
-            </w:pPr>
-            <w:r>
-              <w:rPr>
-                <w:color w:val="666666"/>
-                <w:sz w:val="16"/>
-              </w:rPr>
-              <w:t xml:space="preserve">OFF-042</w:t>
-            </w:r>
-          </w:p>
-        </w:tc>
-        <w:tc>
-          <w:tcPr>
-            <w:tcW w:w="1800" w:type="dxa"/>
-          </w:tcPr>
-          <w:p>
-            <w:pPr>
-              <w:spacing w:after="60"/>
-            </w:pPr>
-            <w:r>
-              <w:rPr>
-                <w:color w:val="444444"/>
-                <w:sz w:val="18"/>
-              </w:rPr>
-              <w:t xml:space="preserve">Veldlabel</w:t>
-            </w:r>
-          </w:p>
-        </w:tc>
-        <w:tc>
-          <w:tcPr>
-            <w:tcW w:w="5900" w:type="dxa"/>
-          </w:tcPr>
-          <w:p>
-            <w:pPr>
-              <w:spacing w:after="60"/>
-            </w:pPr>
-            <w:r>
-              <w:t xml:space="preserve">Ik ga akkoord dat Triple R mijn gegevens gebruikt om deze aanvraag te beantwoorden (</w:t>
-            </w:r>
-          </w:p>
-        </w:tc>
-        <w:tc>
-          <w:tcPr>
-            <w:tcW w:w="5900" w:type="dxa"/>
-            <w:shd w:val="clear" w:color="auto" w:fill="FFFBEA"/>
-          </w:tcPr>
-          <w:p>
-            <w:pPr>
-              <w:spacing w:after="60"/>
-            </w:pPr>
-            <w:r>
-              <w:t xml:space="preserve"/>
-            </w:r>
-          </w:p>
-        </w:tc>
-      </w:tr>
-      <w:tr>
-        <w:trPr>
-          <w:cantSplit/>
-        </w:trPr>
-        <w:tc>
-          <w:tcPr>
-            <w:tcW w:w="1250" w:type="dxa"/>
-          </w:tcPr>
-          <w:p>
-            <w:pPr>
-              <w:spacing w:after="60"/>
-            </w:pPr>
-            <w:r>
-              <w:rPr>
-                <w:color w:val="666666"/>
-                <w:sz w:val="16"/>
-              </w:rPr>
-              <w:t xml:space="preserve">OFF-043</w:t>
-            </w:r>
-          </w:p>
-        </w:tc>
-        <w:tc>
-          <w:tcPr>
-            <w:tcW w:w="1800" w:type="dxa"/>
-          </w:tcPr>
-          <w:p>
-            <w:pPr>
-              <w:spacing w:after="60"/>
-            </w:pPr>
-            <w:r>
-              <w:rPr>
-                <w:color w:val="444444"/>
-                <w:sz w:val="18"/>
-              </w:rPr>
-              <w:t xml:space="preserve">Link</w:t>
-            </w:r>
-          </w:p>
-        </w:tc>
-        <w:tc>
-          <w:tcPr>
-            <w:tcW w:w="5900" w:type="dxa"/>
-          </w:tcPr>
-          <w:p>
-            <w:pPr>
-              <w:spacing w:after="60"/>
-            </w:pPr>
-            <w:r>
-              <w:t xml:space="preserve">privacybeleid</w:t>
+              <w:t xml:space="preserve">Vink dit aan om te versturen.</w:t>
             </w:r>
           </w:p>
         </w:tc>
@@ -44283,20 +44283,20 @@
                 <w:color w:val="444444"/>
                 <w:sz w:val="18"/>
               </w:rPr>
-              <w:t xml:space="preserve">Tekst</w:t>
-            </w:r>
-          </w:p>
-        </w:tc>
-        <w:tc>
-          <w:tcPr>
-            <w:tcW w:w="5900" w:type="dxa"/>
-          </w:tcPr>
-          <w:p>
-            <w:pPr>
-              <w:spacing w:after="60"/>
-            </w:pPr>
-            <w:r>
-              <w:t xml:space="preserve">Vink dit aan om te versturen.</w:t>
+              <w:t xml:space="preserve">Knop</w:t>
+            </w:r>
+          </w:p>
+        </w:tc>
+        <w:tc>
+          <w:tcPr>
+            <w:tcW w:w="5900" w:type="dxa"/>
+          </w:tcPr>
+          <w:p>
+            <w:pPr>
+              <w:spacing w:after="60"/>
+            </w:pPr>
+            <w:r>
+              <w:t xml:space="preserve">Vraag een offerte aan</w:t>
             </w:r>
           </w:p>
         </w:tc>
@@ -44333,72 +44333,6 @@
                 <w:sz w:val="16"/>
               </w:rPr>
               <w:t xml:space="preserve">OFF-045</w:t>
-            </w:r>
-          </w:p>
-        </w:tc>
-        <w:tc>
-          <w:tcPr>
-            <w:tcW w:w="1800" w:type="dxa"/>
-          </w:tcPr>
-          <w:p>
-            <w:pPr>
-              <w:spacing w:after="60"/>
-            </w:pPr>
-            <w:r>
-              <w:rPr>
-                <w:color w:val="444444"/>
-                <w:sz w:val="18"/>
-              </w:rPr>
-              <w:t xml:space="preserve">Knop</w:t>
-            </w:r>
-          </w:p>
-        </w:tc>
-        <w:tc>
-          <w:tcPr>
-            <w:tcW w:w="5900" w:type="dxa"/>
-          </w:tcPr>
-          <w:p>
-            <w:pPr>
-              <w:spacing w:after="60"/>
-            </w:pPr>
-            <w:r>
-              <w:t xml:space="preserve">Vraag een offerte aan</w:t>
-            </w:r>
-          </w:p>
-        </w:tc>
-        <w:tc>
-          <w:tcPr>
-            <w:tcW w:w="5900" w:type="dxa"/>
-            <w:shd w:val="clear" w:color="auto" w:fill="FFFBEA"/>
-          </w:tcPr>
-          <w:p>
-            <w:pPr>
-              <w:spacing w:after="60"/>
-            </w:pPr>
-            <w:r>
-              <w:t xml:space="preserve"/>
-            </w:r>
-          </w:p>
-        </w:tc>
-      </w:tr>
-      <w:tr>
-        <w:trPr>
-          <w:cantSplit/>
-        </w:trPr>
-        <w:tc>
-          <w:tcPr>
-            <w:tcW w:w="1250" w:type="dxa"/>
-          </w:tcPr>
-          <w:p>
-            <w:pPr>
-              <w:spacing w:after="60"/>
-            </w:pPr>
-            <w:r>
-              <w:rPr>
-                <w:color w:val="666666"/>
-                <w:sz w:val="16"/>
-              </w:rPr>
-              <w:t xml:space="preserve">OFF-046</w:t>
             </w:r>
           </w:p>
         </w:tc>

</xml_diff>